<commit_message>
Regenerate alignment data for 2026-09-17 release
</commit_message>
<xml_diff>
--- a/arb/docx/29.content.docx
+++ b/arb/docx/29.content.docx
@@ -9,6 +9,8 @@
       </w:pPr>
       <w:r>
         <w:rPr>
+          <w:rtl/>
+          <w:cs/>
           <w:lang w:val="ar_AE" w:bidi="ar_AE"/>
         </w:rPr>
       </w:r>
@@ -20,53 +22,53 @@
       </w:pPr>
       <w:r>
         <w:rPr>
+          <w:rtl/>
+          <w:cs/>
           <w:lang w:val="ar_AE" w:bidi="ar_AE"/>
         </w:rPr>
         <w:t>Resource: Biblica Open New Arabic Version 2012</w:t>
       </w:r>
       <w:r>
         <w:rPr>
-          <w:lang w:val="ar_AE" w:bidi="ar_AE"/>
-        </w:rPr>
-      </w:r>
-    </w:p>
-    <w:p>
-      <w:pPr>
-        <w:bidi/>
-      </w:pPr>
-      <w:r>
-        <w:rPr>
+          <w:rtl/>
+          <w:cs/>
+          <w:lang w:val="ar_AE" w:bidi="ar_AE"/>
+        </w:rPr>
+      </w:r>
+    </w:p>
+    <w:p>
+      <w:pPr>
+        <w:bidi/>
+      </w:pPr>
+      <w:r>
+        <w:rPr>
+          <w:rtl/>
+          <w:cs/>
           <w:lang w:val="ar_AE" w:bidi="ar_AE"/>
         </w:rPr>
       </w:r>
       <w:r>
         <w:rPr>
           <w:b/>
+          <w:rtl/>
+          <w:cs/>
           <w:lang w:val="ar_AE" w:bidi="ar_AE"/>
         </w:rPr>
         <w:t>Biblica Open New Arabic Version 2012</w:t>
       </w:r>
       <w:r>
         <w:rPr>
-          <w:lang w:val="ar_AE" w:bidi="ar_AE"/>
-        </w:rPr>
-        <w:t xml:space="preserve"> (Arabic) is based on: </w:t>
-      </w:r>
-      <w:r>
-        <w:rPr>
-          <w:lang w:val="ar_AE" w:bidi="ar_AE"/>
-        </w:rPr>
-        <w:t>Biblica Open New Arabic Version 2012</w:t>
-      </w:r>
-      <w:r>
-        <w:rPr>
-          <w:lang w:val="ar_AE" w:bidi="ar_AE"/>
-        </w:rPr>
-        <w:t xml:space="preserve">, </w:t>
+          <w:rtl/>
+          <w:cs/>
+          <w:lang w:val="ar_AE" w:bidi="ar_AE"/>
+        </w:rPr>
+        <w:t xml:space="preserve"> © </w:t>
       </w:r>
       <w:hyperlink r:id="rId13">
         <w:r>
           <w:rPr>
+            <w:rtl/>
+            <w:cs/>
             <w:lang w:val="ar_AE" w:bidi="ar_AE"/>
           </w:rPr>
           <w:rPr>
@@ -78,13 +80,17 @@
       </w:hyperlink>
       <w:r>
         <w:rPr>
-          <w:lang w:val="ar_AE" w:bidi="ar_AE"/>
-        </w:rPr>
-        <w:t xml:space="preserve">, None, which is licensed under a </w:t>
+          <w:rtl/>
+          <w:cs/>
+          <w:lang w:val="ar_AE" w:bidi="ar_AE"/>
+        </w:rPr>
+        <w:t xml:space="preserve">, licensed under a </w:t>
       </w:r>
       <w:hyperlink r:id="rId14">
         <w:r>
           <w:rPr>
+            <w:rtl/>
+            <w:cs/>
             <w:lang w:val="ar_AE" w:bidi="ar_AE"/>
           </w:rPr>
           <w:rPr>
@@ -96,38 +102,23 @@
       </w:hyperlink>
       <w:r>
         <w:rPr>
+          <w:rtl/>
+          <w:cs/>
           <w:lang w:val="ar_AE" w:bidi="ar_AE"/>
         </w:rPr>
         <w:t>.</w:t>
       </w:r>
       <w:r>
         <w:rPr>
-          <w:lang w:val="ar_AE" w:bidi="ar_AE"/>
-        </w:rPr>
-      </w:r>
-    </w:p>
-    <w:p>
-      <w:pPr>
-        <w:bidi/>
-      </w:pPr>
-      <w:r>
-        <w:rPr>
-          <w:lang w:val="ar_AE" w:bidi="ar_AE"/>
-        </w:rPr>
-      </w:r>
-      <w:r>
-        <w:rPr>
-          <w:lang w:val="ar_AE" w:bidi="ar_AE"/>
-        </w:rPr>
-        <w:t>This PDF version is provided under the same license.</w:t>
-      </w:r>
-      <w:r>
-        <w:rPr>
-          <w:lang w:val="ar_AE" w:bidi="ar_AE"/>
-        </w:rPr>
-      </w:r>
-      <w:r>
-        <w:rPr>
+          <w:rtl/>
+          <w:cs/>
+          <w:lang w:val="ar_AE" w:bidi="ar_AE"/>
+        </w:rPr>
+      </w:r>
+      <w:r>
+        <w:rPr>
+          <w:rtl/>
+          <w:cs/>
           <w:lang w:val="ar_AE" w:bidi="ar_AE"/>
         </w:rPr>
       </w:r>
@@ -139,6 +130,8 @@
       </w:pPr>
       <w:r>
         <w:rPr>
+          <w:rtl/>
+          <w:cs/>
           <w:lang w:val="ar_AE" w:bidi="ar_AE"/>
         </w:rPr>
         <w:t>Biblica Open New Arabic Version 2012</w:t>
@@ -168,6 +161,8 @@
       </w:pPr>
       <w:r>
         <w:rPr>
+          <w:rtl/>
+          <w:cs/>
           <w:lang w:val="ar_AE" w:bidi="ar_AE"/>
         </w:rPr>
       </w:r>
@@ -179,32 +174,42 @@
       </w:pPr>
       <w:r>
         <w:rPr>
-          <w:lang w:val="ar_AE" w:bidi="ar_AE"/>
-        </w:rPr>
-      </w:r>
-    </w:p>
-    <w:p>
-      <w:pPr>
-        <w:bidi/>
-      </w:pPr>
-      <w:r>
-        <w:rPr>
-          <w:lang w:val="ar_AE" w:bidi="ar_AE"/>
-        </w:rPr>
-      </w:r>
-      <w:r>
-        <w:rPr>
+          <w:rtl/>
+          <w:cs/>
+          <w:lang w:val="ar_AE" w:bidi="ar_AE"/>
+        </w:rPr>
+      </w:r>
+    </w:p>
+    <w:p>
+      <w:pPr>
+        <w:bidi/>
+      </w:pPr>
+      <w:r>
+        <w:rPr>
+          <w:rtl/>
+          <w:cs/>
+          <w:lang w:val="ar_AE" w:bidi="ar_AE"/>
+        </w:rPr>
+      </w:r>
+      <w:r>
+        <w:rPr>
+          <w:rtl/>
+          <w:cs/>
           <w:lang w:val="ar_AE" w:bidi="ar_AE"/>
         </w:rPr>
         <w:t xml:space="preserve"> </w:t>
       </w:r>
       <w:r>
         <w:rPr>
-          <w:lang w:val="ar_AE" w:bidi="ar_AE"/>
-        </w:rPr>
-      </w:r>
-      <w:r>
-        <w:rPr>
+          <w:rtl/>
+          <w:cs/>
+          <w:lang w:val="ar_AE" w:bidi="ar_AE"/>
+        </w:rPr>
+      </w:r>
+      <w:r>
+        <w:rPr>
+          <w:rtl/>
+          <w:cs/>
           <w:lang w:val="ar_AE" w:bidi="ar_AE"/>
         </w:rPr>
       </w:r>
@@ -226,890 +231,604 @@
     </w:p>
     <w:p>
       <w:pPr>
-        <w:bidi/>
-      </w:pPr>
-      <w:r>
-        <w:rPr>
-          <w:lang w:val="ar_AE" w:bidi="ar_AE"/>
-        </w:rPr>
-      </w:r>
-    </w:p>
-    <w:p>
-      <w:pPr>
         <w:pStyle w:val="Heading2"/>
         <w:bidi/>
       </w:pPr>
       <w:r>
         <w:rPr>
-          <w:lang w:val="ar_AE" w:bidi="ar_AE"/>
-        </w:rPr>
-        <w:t>Joel 1:1</w:t>
-      </w:r>
-      <w:r>
-        <w:rPr>
-          <w:lang w:val="ar_AE" w:bidi="ar_AE"/>
-        </w:rPr>
-      </w:r>
-    </w:p>
-    <w:p>
-      <w:pPr>
-        <w:bidi/>
-      </w:pPr>
-      <w:r>
-        <w:rPr>
-          <w:lang w:val="ar_AE" w:bidi="ar_AE"/>
-        </w:rPr>
-      </w:r>
-      <w:r>
-        <w:rPr>
-          <w:vertAlign w:val="superscript"/>
+          <w:rtl/>
+          <w:cs/>
+          <w:lang w:val="ar_AE" w:bidi="ar_AE"/>
+        </w:rPr>
+        <w:t>يوئيل 1:1</w:t>
+      </w:r>
+      <w:r>
+        <w:rPr>
+          <w:rtl/>
+          <w:cs/>
+          <w:lang w:val="ar_AE" w:bidi="ar_AE"/>
+        </w:rPr>
+      </w:r>
+    </w:p>
+    <w:p>
+      <w:pPr>
+        <w:bidi/>
+      </w:pPr>
+      <w:r>
+        <w:rPr>
+          <w:rtl/>
+          <w:cs/>
+          <w:lang w:val="ar_AE" w:bidi="ar_AE"/>
+        </w:rPr>
+      </w:r>
+      <w:r>
+        <w:rPr>
+          <w:vertAlign w:val="superscript"/>
+          <w:rtl/>
+          <w:cs/>
           <w:lang w:val="ar_AE" w:bidi="ar_AE"/>
         </w:rPr>
         <w:t>1</w:t>
       </w:r>
       <w:r>
         <w:rPr>
+          <w:rtl/>
+          <w:cs/>
           <w:lang w:val="ar_AE" w:bidi="ar_AE"/>
         </w:rPr>
         <w:t xml:space="preserve"> هَذَا مَا أَوْحَى بِهِ الرَّبُّ إِلَى يُوئِيلَ بْنِ فَثُوئِيلَ:</w:t>
       </w:r>
-      <w:r>
-        <w:rPr>
-          <w:lang w:val="ar_AE" w:bidi="ar_AE"/>
-        </w:rPr>
-      </w:r>
-      <w:r>
-        <w:rPr>
-          <w:lang w:val="ar_AE" w:bidi="ar_AE"/>
-        </w:rPr>
-      </w:r>
-    </w:p>
-    <w:p>
-      <w:pPr>
-        <w:bidi/>
-      </w:pPr>
-      <w:r>
-        <w:rPr>
-          <w:lang w:val="ar_AE" w:bidi="ar_AE"/>
-        </w:rPr>
-      </w:r>
-    </w:p>
-    <w:p>
-      <w:pPr>
-        <w:bidi/>
-      </w:pPr>
-      <w:r>
-        <w:rPr>
-          <w:lang w:val="ar_AE" w:bidi="ar_AE"/>
-        </w:rPr>
-      </w:r>
-      <w:r>
-        <w:rPr>
-          <w:vertAlign w:val="superscript"/>
+    </w:p>
+    <w:p>
+      <w:pPr>
+        <w:bidi/>
+      </w:pPr>
+      <w:r>
+        <w:rPr>
+          <w:rtl/>
+          <w:cs/>
+          <w:lang w:val="ar_AE" w:bidi="ar_AE"/>
+        </w:rPr>
+      </w:r>
+      <w:r>
+        <w:rPr>
+          <w:vertAlign w:val="superscript"/>
+          <w:rtl/>
+          <w:cs/>
           <w:lang w:val="ar_AE" w:bidi="ar_AE"/>
         </w:rPr>
         <w:t>2</w:t>
       </w:r>
       <w:r>
         <w:rPr>
+          <w:rtl/>
+          <w:cs/>
           <w:lang w:val="ar_AE" w:bidi="ar_AE"/>
         </w:rPr>
         <w:t xml:space="preserve"> اسْمَعُوا هَذَا أَيُّهَا الشُّيُوخُ، وَأَصْغُوا يَا جَمِيعَ أَهْلِ الأَرْضِ، هَلْ جَرَى مِثْلُ هَذَا فِي أَيَّامِكُمْ أَوْ فِي أَيَّامِ آبَائِكُمْ؟</w:t>
       </w:r>
-      <w:r>
-        <w:rPr>
-          <w:lang w:val="ar_AE" w:bidi="ar_AE"/>
-        </w:rPr>
-      </w:r>
-      <w:r>
-        <w:rPr>
-          <w:lang w:val="ar_AE" w:bidi="ar_AE"/>
-        </w:rPr>
-      </w:r>
-    </w:p>
-    <w:p>
-      <w:pPr>
-        <w:bidi/>
-      </w:pPr>
-      <w:r>
-        <w:rPr>
-          <w:lang w:val="ar_AE" w:bidi="ar_AE"/>
-        </w:rPr>
-      </w:r>
-    </w:p>
-    <w:p>
-      <w:pPr>
-        <w:bidi/>
-      </w:pPr>
-      <w:r>
-        <w:rPr>
-          <w:lang w:val="ar_AE" w:bidi="ar_AE"/>
-        </w:rPr>
-      </w:r>
-      <w:r>
-        <w:rPr>
-          <w:vertAlign w:val="superscript"/>
+    </w:p>
+    <w:p>
+      <w:pPr>
+        <w:bidi/>
+      </w:pPr>
+      <w:r>
+        <w:rPr>
+          <w:rtl/>
+          <w:cs/>
+          <w:lang w:val="ar_AE" w:bidi="ar_AE"/>
+        </w:rPr>
+      </w:r>
+      <w:r>
+        <w:rPr>
+          <w:vertAlign w:val="superscript"/>
+          <w:rtl/>
+          <w:cs/>
           <w:lang w:val="ar_AE" w:bidi="ar_AE"/>
         </w:rPr>
         <w:t>3</w:t>
       </w:r>
       <w:r>
         <w:rPr>
+          <w:rtl/>
+          <w:cs/>
           <w:lang w:val="ar_AE" w:bidi="ar_AE"/>
         </w:rPr>
         <w:t xml:space="preserve"> أَخْبِرُوا بِهَذَا أَبْنَاءَكُمْ، وَلْيُخْبِرْ أَبْنَاؤُكُمْ أَبْنَاءَهُمْ لِيَنْقُلُوهُ إِلَى الأَجْيَالِ الْقَادِمَةِ.</w:t>
       </w:r>
-      <w:r>
-        <w:rPr>
-          <w:lang w:val="ar_AE" w:bidi="ar_AE"/>
-        </w:rPr>
-      </w:r>
-      <w:r>
-        <w:rPr>
-          <w:lang w:val="ar_AE" w:bidi="ar_AE"/>
-        </w:rPr>
-      </w:r>
-    </w:p>
-    <w:p>
-      <w:pPr>
-        <w:bidi/>
-      </w:pPr>
-      <w:r>
-        <w:rPr>
-          <w:lang w:val="ar_AE" w:bidi="ar_AE"/>
-        </w:rPr>
-      </w:r>
-    </w:p>
-    <w:p>
-      <w:pPr>
-        <w:bidi/>
-      </w:pPr>
-      <w:r>
-        <w:rPr>
-          <w:lang w:val="ar_AE" w:bidi="ar_AE"/>
-        </w:rPr>
-      </w:r>
-      <w:r>
-        <w:rPr>
-          <w:vertAlign w:val="superscript"/>
+    </w:p>
+    <w:p>
+      <w:pPr>
+        <w:bidi/>
+      </w:pPr>
+      <w:r>
+        <w:rPr>
+          <w:rtl/>
+          <w:cs/>
+          <w:lang w:val="ar_AE" w:bidi="ar_AE"/>
+        </w:rPr>
+      </w:r>
+      <w:r>
+        <w:rPr>
+          <w:vertAlign w:val="superscript"/>
+          <w:rtl/>
+          <w:cs/>
           <w:lang w:val="ar_AE" w:bidi="ar_AE"/>
         </w:rPr>
         <w:t>4</w:t>
       </w:r>
       <w:r>
         <w:rPr>
+          <w:rtl/>
+          <w:cs/>
           <w:lang w:val="ar_AE" w:bidi="ar_AE"/>
         </w:rPr>
         <w:t xml:space="preserve"> إِنَّ مَا تَخَلَّفَ مِنْ مَحْصُولِكُمْ عَنْ هَجَمَاتِ الزَّحَّافِ الْتَهَمَتْهُ أَسْرَابُ الْجَرَادِ، وَمَا تَفَضَّلَ عَنْ أَسْرَابِ الْجَرَادِ أَكَلَتْهُ الْجَنَادِبُ؛ وَمَا بَقِيَ عَنِ الْجَنَادِبِ قَضَى عَلَيْهِ الطَّيَّارُ.</w:t>
       </w:r>
-      <w:r>
-        <w:rPr>
-          <w:lang w:val="ar_AE" w:bidi="ar_AE"/>
-        </w:rPr>
-      </w:r>
-      <w:r>
-        <w:rPr>
-          <w:lang w:val="ar_AE" w:bidi="ar_AE"/>
-        </w:rPr>
-      </w:r>
-    </w:p>
-    <w:p>
-      <w:pPr>
-        <w:bidi/>
-      </w:pPr>
-      <w:r>
-        <w:rPr>
-          <w:lang w:val="ar_AE" w:bidi="ar_AE"/>
-        </w:rPr>
-      </w:r>
-    </w:p>
-    <w:p>
-      <w:pPr>
-        <w:bidi/>
-      </w:pPr>
-      <w:r>
-        <w:rPr>
-          <w:lang w:val="ar_AE" w:bidi="ar_AE"/>
-        </w:rPr>
-      </w:r>
-      <w:r>
-        <w:rPr>
-          <w:vertAlign w:val="superscript"/>
+    </w:p>
+    <w:p>
+      <w:pPr>
+        <w:bidi/>
+      </w:pPr>
+      <w:r>
+        <w:rPr>
+          <w:rtl/>
+          <w:cs/>
+          <w:lang w:val="ar_AE" w:bidi="ar_AE"/>
+        </w:rPr>
+      </w:r>
+      <w:r>
+        <w:rPr>
+          <w:vertAlign w:val="superscript"/>
+          <w:rtl/>
+          <w:cs/>
           <w:lang w:val="ar_AE" w:bidi="ar_AE"/>
         </w:rPr>
         <w:t>5</w:t>
       </w:r>
       <w:r>
         <w:rPr>
+          <w:rtl/>
+          <w:cs/>
           <w:lang w:val="ar_AE" w:bidi="ar_AE"/>
         </w:rPr>
         <w:t xml:space="preserve"> اصْحُوا أَيُّهَا السَّكَارَى، وَابْكُوا يَا جَمِيعَ مُدْمِنِي الْخَمْرِ عَلَى الْعَصِيرِ لأَنَّهُ قَدِ انْقَطَعَ عَنْ أَفْوَاهِكُمْ.</w:t>
       </w:r>
-      <w:r>
-        <w:rPr>
-          <w:lang w:val="ar_AE" w:bidi="ar_AE"/>
-        </w:rPr>
-      </w:r>
-      <w:r>
-        <w:rPr>
-          <w:lang w:val="ar_AE" w:bidi="ar_AE"/>
-        </w:rPr>
-      </w:r>
-    </w:p>
-    <w:p>
-      <w:pPr>
-        <w:bidi/>
-      </w:pPr>
-      <w:r>
-        <w:rPr>
-          <w:lang w:val="ar_AE" w:bidi="ar_AE"/>
-        </w:rPr>
-      </w:r>
-    </w:p>
-    <w:p>
-      <w:pPr>
-        <w:bidi/>
-      </w:pPr>
-      <w:r>
-        <w:rPr>
-          <w:lang w:val="ar_AE" w:bidi="ar_AE"/>
-        </w:rPr>
-      </w:r>
-      <w:r>
-        <w:rPr>
-          <w:vertAlign w:val="superscript"/>
+    </w:p>
+    <w:p>
+      <w:pPr>
+        <w:bidi/>
+      </w:pPr>
+      <w:r>
+        <w:rPr>
+          <w:rtl/>
+          <w:cs/>
+          <w:lang w:val="ar_AE" w:bidi="ar_AE"/>
+        </w:rPr>
+      </w:r>
+      <w:r>
+        <w:rPr>
+          <w:vertAlign w:val="superscript"/>
+          <w:rtl/>
+          <w:cs/>
           <w:lang w:val="ar_AE" w:bidi="ar_AE"/>
         </w:rPr>
         <w:t>6</w:t>
       </w:r>
       <w:r>
         <w:rPr>
+          <w:rtl/>
+          <w:cs/>
           <w:lang w:val="ar_AE" w:bidi="ar_AE"/>
         </w:rPr>
         <w:t xml:space="preserve"> فَإِنَّ أُمَّةً قَدْ زَحَفَتْ عَلَى أَرْضِي، أُمَّةً قَوِيَّةً لَا تُحْصَى لِكَثْرَتِهَا. لَهَا أَسْنَانُ لَيْثٍ وَأَنْيَابُ لَبُوءَةٍ،</w:t>
       </w:r>
-      <w:r>
-        <w:rPr>
-          <w:lang w:val="ar_AE" w:bidi="ar_AE"/>
-        </w:rPr>
-      </w:r>
-      <w:r>
-        <w:rPr>
-          <w:lang w:val="ar_AE" w:bidi="ar_AE"/>
-        </w:rPr>
-      </w:r>
-    </w:p>
-    <w:p>
-      <w:pPr>
-        <w:bidi/>
-      </w:pPr>
-      <w:r>
-        <w:rPr>
-          <w:lang w:val="ar_AE" w:bidi="ar_AE"/>
-        </w:rPr>
-      </w:r>
-    </w:p>
-    <w:p>
-      <w:pPr>
-        <w:bidi/>
-      </w:pPr>
-      <w:r>
-        <w:rPr>
-          <w:lang w:val="ar_AE" w:bidi="ar_AE"/>
-        </w:rPr>
-      </w:r>
-      <w:r>
-        <w:rPr>
-          <w:vertAlign w:val="superscript"/>
+    </w:p>
+    <w:p>
+      <w:pPr>
+        <w:bidi/>
+      </w:pPr>
+      <w:r>
+        <w:rPr>
+          <w:rtl/>
+          <w:cs/>
+          <w:lang w:val="ar_AE" w:bidi="ar_AE"/>
+        </w:rPr>
+      </w:r>
+      <w:r>
+        <w:rPr>
+          <w:vertAlign w:val="superscript"/>
+          <w:rtl/>
+          <w:cs/>
           <w:lang w:val="ar_AE" w:bidi="ar_AE"/>
         </w:rPr>
         <w:t>7</w:t>
       </w:r>
       <w:r>
         <w:rPr>
+          <w:rtl/>
+          <w:cs/>
           <w:lang w:val="ar_AE" w:bidi="ar_AE"/>
         </w:rPr>
         <w:t xml:space="preserve"> فَأَتْلَفَتْ كُرُومِي وَحَطَّمَتْ أَشْجَارَ بَيْتِي وَسَلَخَتْ قُشُورَهَا وَطَرَحَتْهَا، فَابْيَضَّتْ أَغْصَانُهَا.</w:t>
       </w:r>
-      <w:r>
-        <w:rPr>
-          <w:lang w:val="ar_AE" w:bidi="ar_AE"/>
-        </w:rPr>
-      </w:r>
-      <w:r>
-        <w:rPr>
-          <w:lang w:val="ar_AE" w:bidi="ar_AE"/>
-        </w:rPr>
-      </w:r>
-    </w:p>
-    <w:p>
-      <w:pPr>
-        <w:bidi/>
-      </w:pPr>
-      <w:r>
-        <w:rPr>
-          <w:lang w:val="ar_AE" w:bidi="ar_AE"/>
-        </w:rPr>
-      </w:r>
-    </w:p>
-    <w:p>
-      <w:pPr>
-        <w:bidi/>
-      </w:pPr>
-      <w:r>
-        <w:rPr>
-          <w:lang w:val="ar_AE" w:bidi="ar_AE"/>
-        </w:rPr>
-      </w:r>
-      <w:r>
-        <w:rPr>
-          <w:vertAlign w:val="superscript"/>
+    </w:p>
+    <w:p>
+      <w:pPr>
+        <w:bidi/>
+      </w:pPr>
+      <w:r>
+        <w:rPr>
+          <w:rtl/>
+          <w:cs/>
+          <w:lang w:val="ar_AE" w:bidi="ar_AE"/>
+        </w:rPr>
+      </w:r>
+      <w:r>
+        <w:rPr>
+          <w:vertAlign w:val="superscript"/>
+          <w:rtl/>
+          <w:cs/>
           <w:lang w:val="ar_AE" w:bidi="ar_AE"/>
         </w:rPr>
         <w:t>8</w:t>
       </w:r>
       <w:r>
         <w:rPr>
+          <w:rtl/>
+          <w:cs/>
           <w:lang w:val="ar_AE" w:bidi="ar_AE"/>
         </w:rPr>
         <w:t xml:space="preserve"> نُوحُوا كَمَا تَنُوحُ صَبِيَّةٌ مُتَّشِحَةٌ بِالْمُسُوحِ عَلَى زَوْجِهَا الَّذِي مَاتَ.</w:t>
       </w:r>
-      <w:r>
-        <w:rPr>
-          <w:lang w:val="ar_AE" w:bidi="ar_AE"/>
-        </w:rPr>
-      </w:r>
-      <w:r>
-        <w:rPr>
-          <w:lang w:val="ar_AE" w:bidi="ar_AE"/>
-        </w:rPr>
-      </w:r>
-    </w:p>
-    <w:p>
-      <w:pPr>
-        <w:bidi/>
-      </w:pPr>
-      <w:r>
-        <w:rPr>
-          <w:lang w:val="ar_AE" w:bidi="ar_AE"/>
-        </w:rPr>
-      </w:r>
-    </w:p>
-    <w:p>
-      <w:pPr>
-        <w:bidi/>
-      </w:pPr>
-      <w:r>
-        <w:rPr>
-          <w:lang w:val="ar_AE" w:bidi="ar_AE"/>
-        </w:rPr>
-      </w:r>
-      <w:r>
-        <w:rPr>
-          <w:vertAlign w:val="superscript"/>
+    </w:p>
+    <w:p>
+      <w:pPr>
+        <w:bidi/>
+      </w:pPr>
+      <w:r>
+        <w:rPr>
+          <w:rtl/>
+          <w:cs/>
+          <w:lang w:val="ar_AE" w:bidi="ar_AE"/>
+        </w:rPr>
+      </w:r>
+      <w:r>
+        <w:rPr>
+          <w:vertAlign w:val="superscript"/>
+          <w:rtl/>
+          <w:cs/>
           <w:lang w:val="ar_AE" w:bidi="ar_AE"/>
         </w:rPr>
         <w:t>9</w:t>
       </w:r>
       <w:r>
         <w:rPr>
+          <w:rtl/>
+          <w:cs/>
           <w:lang w:val="ar_AE" w:bidi="ar_AE"/>
         </w:rPr>
         <w:t xml:space="preserve"> لأَنَّ تَقْدِمَاتِ الدَّقِيقِ وَالْخَمْرِ قَدِ انْقَطَعَتْ عَنْ بَيْتِ الرَّبِّ، وَانْتَحَبَ الْكَهَنَةُ خُدَّامُ الرَّبِّ.</w:t>
       </w:r>
-      <w:r>
-        <w:rPr>
-          <w:lang w:val="ar_AE" w:bidi="ar_AE"/>
-        </w:rPr>
-      </w:r>
-      <w:r>
-        <w:rPr>
-          <w:lang w:val="ar_AE" w:bidi="ar_AE"/>
-        </w:rPr>
-      </w:r>
-    </w:p>
-    <w:p>
-      <w:pPr>
-        <w:bidi/>
-      </w:pPr>
-      <w:r>
-        <w:rPr>
-          <w:lang w:val="ar_AE" w:bidi="ar_AE"/>
-        </w:rPr>
-      </w:r>
-    </w:p>
-    <w:p>
-      <w:pPr>
-        <w:bidi/>
-      </w:pPr>
-      <w:r>
-        <w:rPr>
-          <w:lang w:val="ar_AE" w:bidi="ar_AE"/>
-        </w:rPr>
-      </w:r>
-      <w:r>
-        <w:rPr>
-          <w:vertAlign w:val="superscript"/>
+    </w:p>
+    <w:p>
+      <w:pPr>
+        <w:bidi/>
+      </w:pPr>
+      <w:r>
+        <w:rPr>
+          <w:rtl/>
+          <w:cs/>
+          <w:lang w:val="ar_AE" w:bidi="ar_AE"/>
+        </w:rPr>
+      </w:r>
+      <w:r>
+        <w:rPr>
+          <w:vertAlign w:val="superscript"/>
+          <w:rtl/>
+          <w:cs/>
           <w:lang w:val="ar_AE" w:bidi="ar_AE"/>
         </w:rPr>
         <w:t>10</w:t>
       </w:r>
       <w:r>
         <w:rPr>
+          <w:rtl/>
+          <w:cs/>
           <w:lang w:val="ar_AE" w:bidi="ar_AE"/>
         </w:rPr>
         <w:t xml:space="preserve"> قَدْ خَرِبَتِ الْحُقُولُ، وَنَاحَتِ الأَرْضُ لأَنَّ الْحِنْطَةَ تَلِفَتْ وَالْخَمْرَةَ انْقَطَعَتْ، وَافْتُقِدَ زَيْتُ الزَّيْتُونِ.</w:t>
       </w:r>
-      <w:r>
-        <w:rPr>
-          <w:lang w:val="ar_AE" w:bidi="ar_AE"/>
-        </w:rPr>
-      </w:r>
-      <w:r>
-        <w:rPr>
-          <w:lang w:val="ar_AE" w:bidi="ar_AE"/>
-        </w:rPr>
-      </w:r>
-    </w:p>
-    <w:p>
-      <w:pPr>
-        <w:bidi/>
-      </w:pPr>
-      <w:r>
-        <w:rPr>
-          <w:lang w:val="ar_AE" w:bidi="ar_AE"/>
-        </w:rPr>
-      </w:r>
-    </w:p>
-    <w:p>
-      <w:pPr>
-        <w:bidi/>
-      </w:pPr>
-      <w:r>
-        <w:rPr>
-          <w:lang w:val="ar_AE" w:bidi="ar_AE"/>
-        </w:rPr>
-      </w:r>
-      <w:r>
-        <w:rPr>
-          <w:vertAlign w:val="superscript"/>
+    </w:p>
+    <w:p>
+      <w:pPr>
+        <w:bidi/>
+      </w:pPr>
+      <w:r>
+        <w:rPr>
+          <w:rtl/>
+          <w:cs/>
+          <w:lang w:val="ar_AE" w:bidi="ar_AE"/>
+        </w:rPr>
+      </w:r>
+      <w:r>
+        <w:rPr>
+          <w:vertAlign w:val="superscript"/>
+          <w:rtl/>
+          <w:cs/>
           <w:lang w:val="ar_AE" w:bidi="ar_AE"/>
         </w:rPr>
         <w:t>11</w:t>
       </w:r>
       <w:r>
         <w:rPr>
+          <w:rtl/>
+          <w:cs/>
           <w:lang w:val="ar_AE" w:bidi="ar_AE"/>
         </w:rPr>
         <w:t xml:space="preserve"> اخْزَوْا أَيُّهَا الْحَرَّاثُونَ وَوَلْوِلُوا أَيُّهَا الْكَرَّامُونَ عَلَى الْقَمْحِ وَالشَّعِيرِ، لأَنَّ حَصَادَ الْحَقْلِ قَدْ تَلِفَ.</w:t>
       </w:r>
-      <w:r>
-        <w:rPr>
-          <w:lang w:val="ar_AE" w:bidi="ar_AE"/>
-        </w:rPr>
-      </w:r>
-      <w:r>
-        <w:rPr>
-          <w:lang w:val="ar_AE" w:bidi="ar_AE"/>
-        </w:rPr>
-      </w:r>
-    </w:p>
-    <w:p>
-      <w:pPr>
-        <w:bidi/>
-      </w:pPr>
-      <w:r>
-        <w:rPr>
-          <w:lang w:val="ar_AE" w:bidi="ar_AE"/>
-        </w:rPr>
-      </w:r>
-    </w:p>
-    <w:p>
-      <w:pPr>
-        <w:bidi/>
-      </w:pPr>
-      <w:r>
-        <w:rPr>
-          <w:lang w:val="ar_AE" w:bidi="ar_AE"/>
-        </w:rPr>
-      </w:r>
-      <w:r>
-        <w:rPr>
-          <w:vertAlign w:val="superscript"/>
+    </w:p>
+    <w:p>
+      <w:pPr>
+        <w:bidi/>
+      </w:pPr>
+      <w:r>
+        <w:rPr>
+          <w:rtl/>
+          <w:cs/>
+          <w:lang w:val="ar_AE" w:bidi="ar_AE"/>
+        </w:rPr>
+      </w:r>
+      <w:r>
+        <w:rPr>
+          <w:vertAlign w:val="superscript"/>
+          <w:rtl/>
+          <w:cs/>
           <w:lang w:val="ar_AE" w:bidi="ar_AE"/>
         </w:rPr>
         <w:t>12</w:t>
       </w:r>
       <w:r>
         <w:rPr>
+          <w:rtl/>
+          <w:cs/>
           <w:lang w:val="ar_AE" w:bidi="ar_AE"/>
         </w:rPr>
         <w:t xml:space="preserve"> قَدْ ذَوَى الْكَرْمُ وَذَبُلَ التِّينُ وَالرُّمَّانُ وَالنَّخِيلُ وَالتُّفَّاحُ وَيَبِسَتْ سَائِرُ أَشْجَارِ الْحَقْلِ، وَزَالَتِ الْبَهْجَةُ مِنْ أَبْنَاءِ الْبَشَرِ.</w:t>
       </w:r>
-      <w:r>
-        <w:rPr>
-          <w:lang w:val="ar_AE" w:bidi="ar_AE"/>
-        </w:rPr>
-      </w:r>
-      <w:r>
-        <w:rPr>
-          <w:lang w:val="ar_AE" w:bidi="ar_AE"/>
-        </w:rPr>
-      </w:r>
-    </w:p>
-    <w:p>
-      <w:pPr>
-        <w:bidi/>
-      </w:pPr>
-      <w:r>
-        <w:rPr>
-          <w:lang w:val="ar_AE" w:bidi="ar_AE"/>
-        </w:rPr>
-      </w:r>
-    </w:p>
-    <w:p>
-      <w:pPr>
-        <w:bidi/>
-      </w:pPr>
-      <w:r>
-        <w:rPr>
-          <w:lang w:val="ar_AE" w:bidi="ar_AE"/>
-        </w:rPr>
-      </w:r>
-      <w:r>
-        <w:rPr>
-          <w:vertAlign w:val="superscript"/>
+    </w:p>
+    <w:p>
+      <w:pPr>
+        <w:bidi/>
+      </w:pPr>
+      <w:r>
+        <w:rPr>
+          <w:rtl/>
+          <w:cs/>
+          <w:lang w:val="ar_AE" w:bidi="ar_AE"/>
+        </w:rPr>
+      </w:r>
+      <w:r>
+        <w:rPr>
+          <w:vertAlign w:val="superscript"/>
+          <w:rtl/>
+          <w:cs/>
           <w:lang w:val="ar_AE" w:bidi="ar_AE"/>
         </w:rPr>
         <w:t>13</w:t>
       </w:r>
       <w:r>
         <w:rPr>
+          <w:rtl/>
+          <w:cs/>
           <w:lang w:val="ar_AE" w:bidi="ar_AE"/>
         </w:rPr>
         <w:t xml:space="preserve"> أَيُّهَا الْكَهَنَةُ اتَّشِحُوا بِالْمُسُوحِ وَنُوحُوا. وَلْوِلُوا يَا خُدَّامَ الْمَذْبَحِ. تَعَالَوْا وَبِيتُوا لَيْلَتَكُمْ بِالْمُسُوحِ يَا خُدَّامَ إِلَهِي، لأَنَّ تَقْدِمَاتِ الدَّقِيقِ وَالْخَمْرِ قَدْ مُنِعَتْ عَنْ هَيْكَلِ اللهِ.</w:t>
       </w:r>
-      <w:r>
-        <w:rPr>
-          <w:lang w:val="ar_AE" w:bidi="ar_AE"/>
-        </w:rPr>
-      </w:r>
-      <w:r>
-        <w:rPr>
-          <w:lang w:val="ar_AE" w:bidi="ar_AE"/>
-        </w:rPr>
-      </w:r>
-    </w:p>
-    <w:p>
-      <w:pPr>
-        <w:bidi/>
-      </w:pPr>
-      <w:r>
-        <w:rPr>
-          <w:lang w:val="ar_AE" w:bidi="ar_AE"/>
-        </w:rPr>
-      </w:r>
-    </w:p>
-    <w:p>
-      <w:pPr>
-        <w:bidi/>
-      </w:pPr>
-      <w:r>
-        <w:rPr>
-          <w:lang w:val="ar_AE" w:bidi="ar_AE"/>
-        </w:rPr>
-      </w:r>
-      <w:r>
-        <w:rPr>
-          <w:vertAlign w:val="superscript"/>
+    </w:p>
+    <w:p>
+      <w:pPr>
+        <w:bidi/>
+      </w:pPr>
+      <w:r>
+        <w:rPr>
+          <w:rtl/>
+          <w:cs/>
+          <w:lang w:val="ar_AE" w:bidi="ar_AE"/>
+        </w:rPr>
+      </w:r>
+      <w:r>
+        <w:rPr>
+          <w:vertAlign w:val="superscript"/>
+          <w:rtl/>
+          <w:cs/>
           <w:lang w:val="ar_AE" w:bidi="ar_AE"/>
         </w:rPr>
         <w:t>14</w:t>
       </w:r>
       <w:r>
         <w:rPr>
+          <w:rtl/>
+          <w:cs/>
           <w:lang w:val="ar_AE" w:bidi="ar_AE"/>
         </w:rPr>
         <w:t xml:space="preserve"> خَصِّصُوا صَوْماً. نَادُوا بِالاعْتِكَافِ. ادْعُوا الشُّيُوخَ وَجَمِيعَ سُكَّانِ الأَرْضِ لِلاجْتِمَاعِ فِي هَيْكَلِ الرَّبِّ إِلَهِكُمْ وَتَضَرَّعُوا إِلَيْهِ.</w:t>
       </w:r>
-      <w:r>
-        <w:rPr>
-          <w:lang w:val="ar_AE" w:bidi="ar_AE"/>
-        </w:rPr>
-      </w:r>
-      <w:r>
-        <w:rPr>
-          <w:lang w:val="ar_AE" w:bidi="ar_AE"/>
-        </w:rPr>
-      </w:r>
-    </w:p>
-    <w:p>
-      <w:pPr>
-        <w:bidi/>
-      </w:pPr>
-      <w:r>
-        <w:rPr>
-          <w:lang w:val="ar_AE" w:bidi="ar_AE"/>
-        </w:rPr>
-      </w:r>
-    </w:p>
-    <w:p>
-      <w:pPr>
-        <w:bidi/>
-      </w:pPr>
-      <w:r>
-        <w:rPr>
-          <w:lang w:val="ar_AE" w:bidi="ar_AE"/>
-        </w:rPr>
-      </w:r>
-      <w:r>
-        <w:rPr>
-          <w:vertAlign w:val="superscript"/>
+    </w:p>
+    <w:p>
+      <w:pPr>
+        <w:bidi/>
+      </w:pPr>
+      <w:r>
+        <w:rPr>
+          <w:rtl/>
+          <w:cs/>
+          <w:lang w:val="ar_AE" w:bidi="ar_AE"/>
+        </w:rPr>
+      </w:r>
+      <w:r>
+        <w:rPr>
+          <w:vertAlign w:val="superscript"/>
+          <w:rtl/>
+          <w:cs/>
           <w:lang w:val="ar_AE" w:bidi="ar_AE"/>
         </w:rPr>
         <w:t>15</w:t>
       </w:r>
       <w:r>
         <w:rPr>
+          <w:rtl/>
+          <w:cs/>
           <w:lang w:val="ar_AE" w:bidi="ar_AE"/>
         </w:rPr>
         <w:t xml:space="preserve"> يَا لَهُ مِنْ يَوْمٍ رَهِيبٍ، لأَنَّ يَوْمَ الرَّبِّ قَرِيبٌ يَأْتِي حَامِلاً مَعَهُ الدَّمَارَ مِنْ عِنْدِ الْقَدِيرِ.</w:t>
       </w:r>
-      <w:r>
-        <w:rPr>
-          <w:lang w:val="ar_AE" w:bidi="ar_AE"/>
-        </w:rPr>
-      </w:r>
-      <w:r>
-        <w:rPr>
-          <w:lang w:val="ar_AE" w:bidi="ar_AE"/>
-        </w:rPr>
-      </w:r>
-    </w:p>
-    <w:p>
-      <w:pPr>
-        <w:bidi/>
-      </w:pPr>
-      <w:r>
-        <w:rPr>
-          <w:lang w:val="ar_AE" w:bidi="ar_AE"/>
-        </w:rPr>
-      </w:r>
-    </w:p>
-    <w:p>
-      <w:pPr>
-        <w:bidi/>
-      </w:pPr>
-      <w:r>
-        <w:rPr>
-          <w:lang w:val="ar_AE" w:bidi="ar_AE"/>
-        </w:rPr>
-      </w:r>
-      <w:r>
-        <w:rPr>
-          <w:vertAlign w:val="superscript"/>
+    </w:p>
+    <w:p>
+      <w:pPr>
+        <w:bidi/>
+      </w:pPr>
+      <w:r>
+        <w:rPr>
+          <w:rtl/>
+          <w:cs/>
+          <w:lang w:val="ar_AE" w:bidi="ar_AE"/>
+        </w:rPr>
+      </w:r>
+      <w:r>
+        <w:rPr>
+          <w:vertAlign w:val="superscript"/>
+          <w:rtl/>
+          <w:cs/>
           <w:lang w:val="ar_AE" w:bidi="ar_AE"/>
         </w:rPr>
         <w:t>16</w:t>
       </w:r>
       <w:r>
         <w:rPr>
+          <w:rtl/>
+          <w:cs/>
           <w:lang w:val="ar_AE" w:bidi="ar_AE"/>
         </w:rPr>
         <w:t xml:space="preserve"> أَلَمْ يَنْقَطِعِ الطَّعَامُ أَمَامَ عُيُونِنَا، أَلَمْ يَتَلاشَ الْفَرَحُ وَالْغِبْطَةُ مِنْ بَيْتِ إِلَهِنَا؟</w:t>
       </w:r>
-      <w:r>
-        <w:rPr>
-          <w:lang w:val="ar_AE" w:bidi="ar_AE"/>
-        </w:rPr>
-      </w:r>
-      <w:r>
-        <w:rPr>
-          <w:lang w:val="ar_AE" w:bidi="ar_AE"/>
-        </w:rPr>
-      </w:r>
-    </w:p>
-    <w:p>
-      <w:pPr>
-        <w:bidi/>
-      </w:pPr>
-      <w:r>
-        <w:rPr>
-          <w:lang w:val="ar_AE" w:bidi="ar_AE"/>
-        </w:rPr>
-      </w:r>
-    </w:p>
-    <w:p>
-      <w:pPr>
-        <w:bidi/>
-      </w:pPr>
-      <w:r>
-        <w:rPr>
-          <w:lang w:val="ar_AE" w:bidi="ar_AE"/>
-        </w:rPr>
-      </w:r>
-      <w:r>
-        <w:rPr>
-          <w:vertAlign w:val="superscript"/>
+    </w:p>
+    <w:p>
+      <w:pPr>
+        <w:bidi/>
+      </w:pPr>
+      <w:r>
+        <w:rPr>
+          <w:rtl/>
+          <w:cs/>
+          <w:lang w:val="ar_AE" w:bidi="ar_AE"/>
+        </w:rPr>
+      </w:r>
+      <w:r>
+        <w:rPr>
+          <w:vertAlign w:val="superscript"/>
+          <w:rtl/>
+          <w:cs/>
           <w:lang w:val="ar_AE" w:bidi="ar_AE"/>
         </w:rPr>
         <w:t>17</w:t>
       </w:r>
       <w:r>
         <w:rPr>
+          <w:rtl/>
+          <w:cs/>
           <w:lang w:val="ar_AE" w:bidi="ar_AE"/>
         </w:rPr>
         <w:t xml:space="preserve"> قَدْ تَعَفَّنَتِ الْحُبُوبُ الْمَزْرُوعَةُ فِي الأَرْضِ الْجَافَّةِ، وَتَهَدَّمَتِ الْمَخَازِنُ وَفَرِغَتِ الصَّوَامِعُ مِنَ الْقَمْحِ، لأَنَّ الْحُبُوبَ قَدْ جَفَّتْ.</w:t>
       </w:r>
-      <w:r>
-        <w:rPr>
-          <w:lang w:val="ar_AE" w:bidi="ar_AE"/>
-        </w:rPr>
-      </w:r>
-      <w:r>
-        <w:rPr>
-          <w:lang w:val="ar_AE" w:bidi="ar_AE"/>
-        </w:rPr>
-      </w:r>
-    </w:p>
-    <w:p>
-      <w:pPr>
-        <w:bidi/>
-      </w:pPr>
-      <w:r>
-        <w:rPr>
-          <w:lang w:val="ar_AE" w:bidi="ar_AE"/>
-        </w:rPr>
-      </w:r>
-    </w:p>
-    <w:p>
-      <w:pPr>
-        <w:bidi/>
-      </w:pPr>
-      <w:r>
-        <w:rPr>
-          <w:lang w:val="ar_AE" w:bidi="ar_AE"/>
-        </w:rPr>
-      </w:r>
-      <w:r>
-        <w:rPr>
-          <w:vertAlign w:val="superscript"/>
+    </w:p>
+    <w:p>
+      <w:pPr>
+        <w:bidi/>
+      </w:pPr>
+      <w:r>
+        <w:rPr>
+          <w:rtl/>
+          <w:cs/>
+          <w:lang w:val="ar_AE" w:bidi="ar_AE"/>
+        </w:rPr>
+      </w:r>
+      <w:r>
+        <w:rPr>
+          <w:vertAlign w:val="superscript"/>
+          <w:rtl/>
+          <w:cs/>
           <w:lang w:val="ar_AE" w:bidi="ar_AE"/>
         </w:rPr>
         <w:t>18</w:t>
       </w:r>
       <w:r>
         <w:rPr>
+          <w:rtl/>
+          <w:cs/>
           <w:lang w:val="ar_AE" w:bidi="ar_AE"/>
         </w:rPr>
         <w:t xml:space="preserve"> لَكَمْ أَنَّتِ الْبَهَائِمُ، وَشَرَدَتِ الْمَوَاشِي إِذِ افْتَقَرَتْ إِلَى الْمَرْعَى. حَتَّى قُطْعَانُ الْغَنَمِ هَلَكَتْ أَيْضاً.</w:t>
       </w:r>
-      <w:r>
-        <w:rPr>
-          <w:lang w:val="ar_AE" w:bidi="ar_AE"/>
-        </w:rPr>
-      </w:r>
-      <w:r>
-        <w:rPr>
-          <w:lang w:val="ar_AE" w:bidi="ar_AE"/>
-        </w:rPr>
-      </w:r>
-    </w:p>
-    <w:p>
-      <w:pPr>
-        <w:bidi/>
-      </w:pPr>
-      <w:r>
-        <w:rPr>
-          <w:lang w:val="ar_AE" w:bidi="ar_AE"/>
-        </w:rPr>
-      </w:r>
-    </w:p>
-    <w:p>
-      <w:pPr>
-        <w:bidi/>
-      </w:pPr>
-      <w:r>
-        <w:rPr>
-          <w:lang w:val="ar_AE" w:bidi="ar_AE"/>
-        </w:rPr>
-      </w:r>
-      <w:r>
-        <w:rPr>
-          <w:vertAlign w:val="superscript"/>
+    </w:p>
+    <w:p>
+      <w:pPr>
+        <w:bidi/>
+      </w:pPr>
+      <w:r>
+        <w:rPr>
+          <w:rtl/>
+          <w:cs/>
+          <w:lang w:val="ar_AE" w:bidi="ar_AE"/>
+        </w:rPr>
+      </w:r>
+      <w:r>
+        <w:rPr>
+          <w:vertAlign w:val="superscript"/>
+          <w:rtl/>
+          <w:cs/>
           <w:lang w:val="ar_AE" w:bidi="ar_AE"/>
         </w:rPr>
         <w:t>19</w:t>
       </w:r>
       <w:r>
         <w:rPr>
+          <w:rtl/>
+          <w:cs/>
           <w:lang w:val="ar_AE" w:bidi="ar_AE"/>
         </w:rPr>
         <w:t xml:space="preserve"> إِلَيْكَ يَا رَبُّ أَصْرُخُ لأَنَّ النَّارَ قَدِ الْتَهَمَتْ مَرَاعِيَ الْبَرِّيَّةِ، وَأَحْرَقَ اللَّهِيبُ كُلَّ أَشْجَارِ الْحَقْلِ.</w:t>
       </w:r>
-      <w:r>
-        <w:rPr>
-          <w:lang w:val="ar_AE" w:bidi="ar_AE"/>
-        </w:rPr>
-      </w:r>
-      <w:r>
-        <w:rPr>
-          <w:lang w:val="ar_AE" w:bidi="ar_AE"/>
-        </w:rPr>
-      </w:r>
-    </w:p>
-    <w:p>
-      <w:pPr>
-        <w:bidi/>
-      </w:pPr>
-      <w:r>
-        <w:rPr>
-          <w:lang w:val="ar_AE" w:bidi="ar_AE"/>
-        </w:rPr>
-      </w:r>
-    </w:p>
-    <w:p>
-      <w:pPr>
-        <w:bidi/>
-      </w:pPr>
-      <w:r>
-        <w:rPr>
-          <w:lang w:val="ar_AE" w:bidi="ar_AE"/>
-        </w:rPr>
-      </w:r>
-      <w:r>
-        <w:rPr>
-          <w:vertAlign w:val="superscript"/>
+    </w:p>
+    <w:p>
+      <w:pPr>
+        <w:bidi/>
+      </w:pPr>
+      <w:r>
+        <w:rPr>
+          <w:rtl/>
+          <w:cs/>
+          <w:lang w:val="ar_AE" w:bidi="ar_AE"/>
+        </w:rPr>
+      </w:r>
+      <w:r>
+        <w:rPr>
+          <w:vertAlign w:val="superscript"/>
+          <w:rtl/>
+          <w:cs/>
           <w:lang w:val="ar_AE" w:bidi="ar_AE"/>
         </w:rPr>
         <w:t>20</w:t>
       </w:r>
       <w:r>
         <w:rPr>
+          <w:rtl/>
+          <w:cs/>
           <w:lang w:val="ar_AE" w:bidi="ar_AE"/>
         </w:rPr>
         <w:t xml:space="preserve"> حَتَّى الْحَيَوَانَاتُ الْبَرِّيَّةُ اسْتَغَاثَتْ بِكَ، لأَنَّ مِيَاهَ الْجَدَاوِلِ الْجَارِيَةَ قَدْ جَفَّتْ، وَالْتَهَمَتِ النِّيرَانُ مَرَاعِيَ الْبَرِّيَّةِ.</w:t>
       </w:r>
-      <w:r>
-        <w:rPr>
-          <w:lang w:val="ar_AE" w:bidi="ar_AE"/>
-        </w:rPr>
-      </w:r>
-      <w:r>
-        <w:rPr>
-          <w:lang w:val="ar_AE" w:bidi="ar_AE"/>
-        </w:rPr>
-      </w:r>
-    </w:p>
-    <w:p>
-      <w:pPr>
-        <w:bidi/>
-      </w:pPr>
-      <w:r>
-        <w:rPr>
-          <w:lang w:val="ar_AE" w:bidi="ar_AE"/>
-        </w:rPr>
-      </w:r>
     </w:p>
     <w:p>
       <w:pPr>
@@ -1118,1391 +837,947 @@
       </w:pPr>
       <w:r>
         <w:rPr>
-          <w:lang w:val="ar_AE" w:bidi="ar_AE"/>
-        </w:rPr>
-        <w:t>Joel 2:1</w:t>
-      </w:r>
-      <w:r>
-        <w:rPr>
-          <w:lang w:val="ar_AE" w:bidi="ar_AE"/>
-        </w:rPr>
-      </w:r>
-    </w:p>
-    <w:p>
-      <w:pPr>
-        <w:bidi/>
-      </w:pPr>
-      <w:r>
-        <w:rPr>
-          <w:lang w:val="ar_AE" w:bidi="ar_AE"/>
-        </w:rPr>
-      </w:r>
-      <w:r>
-        <w:rPr>
-          <w:vertAlign w:val="superscript"/>
+          <w:rtl/>
+          <w:cs/>
+          <w:lang w:val="ar_AE" w:bidi="ar_AE"/>
+        </w:rPr>
+        <w:t>يوئيل 2:1</w:t>
+      </w:r>
+      <w:r>
+        <w:rPr>
+          <w:rtl/>
+          <w:cs/>
+          <w:lang w:val="ar_AE" w:bidi="ar_AE"/>
+        </w:rPr>
+      </w:r>
+    </w:p>
+    <w:p>
+      <w:pPr>
+        <w:bidi/>
+      </w:pPr>
+      <w:r>
+        <w:rPr>
+          <w:rtl/>
+          <w:cs/>
+          <w:lang w:val="ar_AE" w:bidi="ar_AE"/>
+        </w:rPr>
+      </w:r>
+      <w:r>
+        <w:rPr>
+          <w:vertAlign w:val="superscript"/>
+          <w:rtl/>
+          <w:cs/>
           <w:lang w:val="ar_AE" w:bidi="ar_AE"/>
         </w:rPr>
         <w:t>1</w:t>
       </w:r>
       <w:r>
         <w:rPr>
+          <w:rtl/>
+          <w:cs/>
           <w:lang w:val="ar_AE" w:bidi="ar_AE"/>
         </w:rPr>
         <w:t xml:space="preserve"> انْفُخُوا بِالْبُوقِ فِي صِهْيَوْنَ، وَأَطْلِقُوا نَفِيرَ الإِنْذَارِ فِي جَبَلِ قُدْسِي، وَلْيَرْتَعِدْ جَمِيعُ سُكَّانِ الأَرْضِ، لأَنَّ يَوْمَ الرَّبِّ مُقْبِلٌ وَقَدْ بَاتَ وَشِيكاً.</w:t>
       </w:r>
-      <w:r>
-        <w:rPr>
-          <w:lang w:val="ar_AE" w:bidi="ar_AE"/>
-        </w:rPr>
-      </w:r>
-      <w:r>
-        <w:rPr>
-          <w:lang w:val="ar_AE" w:bidi="ar_AE"/>
-        </w:rPr>
-      </w:r>
-    </w:p>
-    <w:p>
-      <w:pPr>
-        <w:bidi/>
-      </w:pPr>
-      <w:r>
-        <w:rPr>
-          <w:lang w:val="ar_AE" w:bidi="ar_AE"/>
-        </w:rPr>
-      </w:r>
-    </w:p>
-    <w:p>
-      <w:pPr>
-        <w:bidi/>
-      </w:pPr>
-      <w:r>
-        <w:rPr>
-          <w:lang w:val="ar_AE" w:bidi="ar_AE"/>
-        </w:rPr>
-      </w:r>
-      <w:r>
-        <w:rPr>
-          <w:vertAlign w:val="superscript"/>
+    </w:p>
+    <w:p>
+      <w:pPr>
+        <w:bidi/>
+      </w:pPr>
+      <w:r>
+        <w:rPr>
+          <w:rtl/>
+          <w:cs/>
+          <w:lang w:val="ar_AE" w:bidi="ar_AE"/>
+        </w:rPr>
+      </w:r>
+      <w:r>
+        <w:rPr>
+          <w:vertAlign w:val="superscript"/>
+          <w:rtl/>
+          <w:cs/>
           <w:lang w:val="ar_AE" w:bidi="ar_AE"/>
         </w:rPr>
         <w:t>2</w:t>
       </w:r>
       <w:r>
         <w:rPr>
+          <w:rtl/>
+          <w:cs/>
           <w:lang w:val="ar_AE" w:bidi="ar_AE"/>
         </w:rPr>
         <w:t xml:space="preserve"> هُوَ يَوْمُ ظُلْمَةٍ وَتَجَهُّمٍ، يَوْمُ غُيُومٍ مُكْفَهِرَّةٍ وَقَتَامٍ دَامِسٍ، فِيهِ تَزْحَفُ أُمَّةٌ قَوِيَّةٌ وَعَظِيمَةٌ كَمَا يَزْحَفُ الظَّلامُ عَلَى الْجِبَالِ، أُمَّةٌ لَمْ يَكُنْ لَهَا شَبِيهٌ فِي سَالِفِ الزَّمَانِ، وَلَنْ يَكُونَ لَهَا نَظِيرٌ مِنْ بَعْدِهَا عَبْرَ سِنِي الأَجْيَالِ.</w:t>
       </w:r>
-      <w:r>
-        <w:rPr>
-          <w:lang w:val="ar_AE" w:bidi="ar_AE"/>
-        </w:rPr>
-      </w:r>
-      <w:r>
-        <w:rPr>
-          <w:lang w:val="ar_AE" w:bidi="ar_AE"/>
-        </w:rPr>
-      </w:r>
-    </w:p>
-    <w:p>
-      <w:pPr>
-        <w:bidi/>
-      </w:pPr>
-      <w:r>
-        <w:rPr>
-          <w:lang w:val="ar_AE" w:bidi="ar_AE"/>
-        </w:rPr>
-      </w:r>
-    </w:p>
-    <w:p>
-      <w:pPr>
-        <w:bidi/>
-      </w:pPr>
-      <w:r>
-        <w:rPr>
-          <w:lang w:val="ar_AE" w:bidi="ar_AE"/>
-        </w:rPr>
-      </w:r>
-      <w:r>
-        <w:rPr>
-          <w:vertAlign w:val="superscript"/>
+    </w:p>
+    <w:p>
+      <w:pPr>
+        <w:bidi/>
+      </w:pPr>
+      <w:r>
+        <w:rPr>
+          <w:rtl/>
+          <w:cs/>
+          <w:lang w:val="ar_AE" w:bidi="ar_AE"/>
+        </w:rPr>
+      </w:r>
+      <w:r>
+        <w:rPr>
+          <w:vertAlign w:val="superscript"/>
+          <w:rtl/>
+          <w:cs/>
           <w:lang w:val="ar_AE" w:bidi="ar_AE"/>
         </w:rPr>
         <w:t>3</w:t>
       </w:r>
       <w:r>
         <w:rPr>
+          <w:rtl/>
+          <w:cs/>
           <w:lang w:val="ar_AE" w:bidi="ar_AE"/>
         </w:rPr>
         <w:t xml:space="preserve"> تَلْتَهِمُ النَّارُ مَا أَمَامَهَا، وَيُحْرِقُ اللهِيبُ مَا خَلْفَهَا. الأَرْضُ قُدَّامَهَا كَجَنَّةِ عَدْنٍ، وَخَلْفَهَا صَحْرَاءُ مُوْحِشَةٌ، وَلا شَيْءَ يَنْجُو مِنْهَا.</w:t>
       </w:r>
-      <w:r>
-        <w:rPr>
-          <w:lang w:val="ar_AE" w:bidi="ar_AE"/>
-        </w:rPr>
-      </w:r>
-      <w:r>
-        <w:rPr>
-          <w:lang w:val="ar_AE" w:bidi="ar_AE"/>
-        </w:rPr>
-      </w:r>
-    </w:p>
-    <w:p>
-      <w:pPr>
-        <w:bidi/>
-      </w:pPr>
-      <w:r>
-        <w:rPr>
-          <w:lang w:val="ar_AE" w:bidi="ar_AE"/>
-        </w:rPr>
-      </w:r>
-    </w:p>
-    <w:p>
-      <w:pPr>
-        <w:bidi/>
-      </w:pPr>
-      <w:r>
-        <w:rPr>
-          <w:lang w:val="ar_AE" w:bidi="ar_AE"/>
-        </w:rPr>
-      </w:r>
-      <w:r>
-        <w:rPr>
-          <w:vertAlign w:val="superscript"/>
+    </w:p>
+    <w:p>
+      <w:pPr>
+        <w:bidi/>
+      </w:pPr>
+      <w:r>
+        <w:rPr>
+          <w:rtl/>
+          <w:cs/>
+          <w:lang w:val="ar_AE" w:bidi="ar_AE"/>
+        </w:rPr>
+      </w:r>
+      <w:r>
+        <w:rPr>
+          <w:vertAlign w:val="superscript"/>
+          <w:rtl/>
+          <w:cs/>
           <w:lang w:val="ar_AE" w:bidi="ar_AE"/>
         </w:rPr>
         <w:t>4</w:t>
       </w:r>
       <w:r>
         <w:rPr>
+          <w:rtl/>
+          <w:cs/>
           <w:lang w:val="ar_AE" w:bidi="ar_AE"/>
         </w:rPr>
         <w:t xml:space="preserve"> مَنْظَرُهُمْ كَالْخُيُولِ، وَكَأَفْرَاسِ الْحَرْبِ يَرْكُضُونَ.</w:t>
       </w:r>
-      <w:r>
-        <w:rPr>
-          <w:lang w:val="ar_AE" w:bidi="ar_AE"/>
-        </w:rPr>
-      </w:r>
-      <w:r>
-        <w:rPr>
-          <w:lang w:val="ar_AE" w:bidi="ar_AE"/>
-        </w:rPr>
-      </w:r>
-    </w:p>
-    <w:p>
-      <w:pPr>
-        <w:bidi/>
-      </w:pPr>
-      <w:r>
-        <w:rPr>
-          <w:lang w:val="ar_AE" w:bidi="ar_AE"/>
-        </w:rPr>
-      </w:r>
-    </w:p>
-    <w:p>
-      <w:pPr>
-        <w:bidi/>
-      </w:pPr>
-      <w:r>
-        <w:rPr>
-          <w:lang w:val="ar_AE" w:bidi="ar_AE"/>
-        </w:rPr>
-      </w:r>
-      <w:r>
-        <w:rPr>
-          <w:vertAlign w:val="superscript"/>
+    </w:p>
+    <w:p>
+      <w:pPr>
+        <w:bidi/>
+      </w:pPr>
+      <w:r>
+        <w:rPr>
+          <w:rtl/>
+          <w:cs/>
+          <w:lang w:val="ar_AE" w:bidi="ar_AE"/>
+        </w:rPr>
+      </w:r>
+      <w:r>
+        <w:rPr>
+          <w:vertAlign w:val="superscript"/>
+          <w:rtl/>
+          <w:cs/>
           <w:lang w:val="ar_AE" w:bidi="ar_AE"/>
         </w:rPr>
         <w:t>5</w:t>
       </w:r>
       <w:r>
         <w:rPr>
+          <w:rtl/>
+          <w:cs/>
           <w:lang w:val="ar_AE" w:bidi="ar_AE"/>
         </w:rPr>
         <w:t xml:space="preserve"> يَثِبُونَ عَلَى رُؤُوسِ الْجِبَالِ فِي جَلَبَةٍ كَجَلَبَةِ الْمَرْكَبَاتِ، كَفَرْقَعَةِ لَهِيبِ نَارٍ يَلْتَهِمُ الْقَشَّ، وَكَجَيْشٍ عَاتٍ مُصْطَفٍّ لِلْقِتَالِ.</w:t>
       </w:r>
-      <w:r>
-        <w:rPr>
-          <w:lang w:val="ar_AE" w:bidi="ar_AE"/>
-        </w:rPr>
-      </w:r>
-      <w:r>
-        <w:rPr>
-          <w:lang w:val="ar_AE" w:bidi="ar_AE"/>
-        </w:rPr>
-      </w:r>
-    </w:p>
-    <w:p>
-      <w:pPr>
-        <w:bidi/>
-      </w:pPr>
-      <w:r>
-        <w:rPr>
-          <w:lang w:val="ar_AE" w:bidi="ar_AE"/>
-        </w:rPr>
-      </w:r>
-    </w:p>
-    <w:p>
-      <w:pPr>
-        <w:bidi/>
-      </w:pPr>
-      <w:r>
-        <w:rPr>
-          <w:lang w:val="ar_AE" w:bidi="ar_AE"/>
-        </w:rPr>
-      </w:r>
-      <w:r>
-        <w:rPr>
-          <w:vertAlign w:val="superscript"/>
+    </w:p>
+    <w:p>
+      <w:pPr>
+        <w:bidi/>
+      </w:pPr>
+      <w:r>
+        <w:rPr>
+          <w:rtl/>
+          <w:cs/>
+          <w:lang w:val="ar_AE" w:bidi="ar_AE"/>
+        </w:rPr>
+      </w:r>
+      <w:r>
+        <w:rPr>
+          <w:vertAlign w:val="superscript"/>
+          <w:rtl/>
+          <w:cs/>
           <w:lang w:val="ar_AE" w:bidi="ar_AE"/>
         </w:rPr>
         <w:t>6</w:t>
       </w:r>
       <w:r>
         <w:rPr>
+          <w:rtl/>
+          <w:cs/>
           <w:lang w:val="ar_AE" w:bidi="ar_AE"/>
         </w:rPr>
         <w:t xml:space="preserve"> تَنْتَابُ الرِّعْدَةُ مِنْهُمْ جَمِيعَ الشُّعُوبِ وَتَشْحَبُ كُلُّ الْوُجُوهِ.</w:t>
       </w:r>
-      <w:r>
-        <w:rPr>
-          <w:lang w:val="ar_AE" w:bidi="ar_AE"/>
-        </w:rPr>
-      </w:r>
-      <w:r>
-        <w:rPr>
-          <w:lang w:val="ar_AE" w:bidi="ar_AE"/>
-        </w:rPr>
-      </w:r>
-    </w:p>
-    <w:p>
-      <w:pPr>
-        <w:bidi/>
-      </w:pPr>
-      <w:r>
-        <w:rPr>
-          <w:lang w:val="ar_AE" w:bidi="ar_AE"/>
-        </w:rPr>
-      </w:r>
-    </w:p>
-    <w:p>
-      <w:pPr>
-        <w:bidi/>
-      </w:pPr>
-      <w:r>
-        <w:rPr>
-          <w:lang w:val="ar_AE" w:bidi="ar_AE"/>
-        </w:rPr>
-      </w:r>
-      <w:r>
-        <w:rPr>
-          <w:vertAlign w:val="superscript"/>
+    </w:p>
+    <w:p>
+      <w:pPr>
+        <w:bidi/>
+      </w:pPr>
+      <w:r>
+        <w:rPr>
+          <w:rtl/>
+          <w:cs/>
+          <w:lang w:val="ar_AE" w:bidi="ar_AE"/>
+        </w:rPr>
+      </w:r>
+      <w:r>
+        <w:rPr>
+          <w:vertAlign w:val="superscript"/>
+          <w:rtl/>
+          <w:cs/>
           <w:lang w:val="ar_AE" w:bidi="ar_AE"/>
         </w:rPr>
         <w:t>7</w:t>
       </w:r>
       <w:r>
         <w:rPr>
+          <w:rtl/>
+          <w:cs/>
           <w:lang w:val="ar_AE" w:bidi="ar_AE"/>
         </w:rPr>
         <w:t xml:space="preserve"> يَنْدَفِعُونَ كَالْجَبَابِرَةِ وَكَرِجَالِ الْحَرْبِ يَتَسَلَّقُونَ السُّورَ، وَكُلٌّ مِنْهُمْ يَزْحَفُ فِي طَرِيقِهِ لَا يَحِيدُ عَنْ سَبِيلِهِ.</w:t>
       </w:r>
-      <w:r>
-        <w:rPr>
-          <w:lang w:val="ar_AE" w:bidi="ar_AE"/>
-        </w:rPr>
-      </w:r>
-      <w:r>
-        <w:rPr>
-          <w:lang w:val="ar_AE" w:bidi="ar_AE"/>
-        </w:rPr>
-      </w:r>
-    </w:p>
-    <w:p>
-      <w:pPr>
-        <w:bidi/>
-      </w:pPr>
-      <w:r>
-        <w:rPr>
-          <w:lang w:val="ar_AE" w:bidi="ar_AE"/>
-        </w:rPr>
-      </w:r>
-    </w:p>
-    <w:p>
-      <w:pPr>
-        <w:bidi/>
-      </w:pPr>
-      <w:r>
-        <w:rPr>
-          <w:lang w:val="ar_AE" w:bidi="ar_AE"/>
-        </w:rPr>
-      </w:r>
-      <w:r>
-        <w:rPr>
-          <w:vertAlign w:val="superscript"/>
+    </w:p>
+    <w:p>
+      <w:pPr>
+        <w:bidi/>
+      </w:pPr>
+      <w:r>
+        <w:rPr>
+          <w:rtl/>
+          <w:cs/>
+          <w:lang w:val="ar_AE" w:bidi="ar_AE"/>
+        </w:rPr>
+      </w:r>
+      <w:r>
+        <w:rPr>
+          <w:vertAlign w:val="superscript"/>
+          <w:rtl/>
+          <w:cs/>
           <w:lang w:val="ar_AE" w:bidi="ar_AE"/>
         </w:rPr>
         <w:t>8</w:t>
       </w:r>
       <w:r>
         <w:rPr>
+          <w:rtl/>
+          <w:cs/>
           <w:lang w:val="ar_AE" w:bidi="ar_AE"/>
         </w:rPr>
         <w:t xml:space="preserve"> لَا يُزَاحِمُ بَعْضُهُمْ بَعْضاً. بَلْ يَتَقَدَّمُ كُلٌّ مِنْهُمْ فِي طَرِيقِهِ. يَنْسَلُّونَ بَيْنَ الأَسْلِحَةِ مِنْ غَيْرِ أَنْ يَتَوَقَّفُوا.</w:t>
       </w:r>
-      <w:r>
-        <w:rPr>
-          <w:lang w:val="ar_AE" w:bidi="ar_AE"/>
-        </w:rPr>
-      </w:r>
-      <w:r>
-        <w:rPr>
-          <w:lang w:val="ar_AE" w:bidi="ar_AE"/>
-        </w:rPr>
-      </w:r>
-    </w:p>
-    <w:p>
-      <w:pPr>
-        <w:bidi/>
-      </w:pPr>
-      <w:r>
-        <w:rPr>
-          <w:lang w:val="ar_AE" w:bidi="ar_AE"/>
-        </w:rPr>
-      </w:r>
-    </w:p>
-    <w:p>
-      <w:pPr>
-        <w:bidi/>
-      </w:pPr>
-      <w:r>
-        <w:rPr>
-          <w:lang w:val="ar_AE" w:bidi="ar_AE"/>
-        </w:rPr>
-      </w:r>
-      <w:r>
-        <w:rPr>
-          <w:vertAlign w:val="superscript"/>
+    </w:p>
+    <w:p>
+      <w:pPr>
+        <w:bidi/>
+      </w:pPr>
+      <w:r>
+        <w:rPr>
+          <w:rtl/>
+          <w:cs/>
+          <w:lang w:val="ar_AE" w:bidi="ar_AE"/>
+        </w:rPr>
+      </w:r>
+      <w:r>
+        <w:rPr>
+          <w:vertAlign w:val="superscript"/>
+          <w:rtl/>
+          <w:cs/>
           <w:lang w:val="ar_AE" w:bidi="ar_AE"/>
         </w:rPr>
         <w:t>9</w:t>
       </w:r>
       <w:r>
         <w:rPr>
+          <w:rtl/>
+          <w:cs/>
           <w:lang w:val="ar_AE" w:bidi="ar_AE"/>
         </w:rPr>
         <w:t xml:space="preserve"> يَنْقَضُّونَ عَلَى الْمَدِينَةِ وَيَتَوَاثَبُونَ فَوْقَ الأَسْوَارِ، يَتَسَلَّقُونَ الْبُيُوتَ وَيَتَسَلَّلُونَ مِنَ الْكُوَى كَاللِّصِّ.</w:t>
       </w:r>
-      <w:r>
-        <w:rPr>
-          <w:lang w:val="ar_AE" w:bidi="ar_AE"/>
-        </w:rPr>
-      </w:r>
-      <w:r>
-        <w:rPr>
-          <w:lang w:val="ar_AE" w:bidi="ar_AE"/>
-        </w:rPr>
-      </w:r>
-    </w:p>
-    <w:p>
-      <w:pPr>
-        <w:bidi/>
-      </w:pPr>
-      <w:r>
-        <w:rPr>
-          <w:lang w:val="ar_AE" w:bidi="ar_AE"/>
-        </w:rPr>
-      </w:r>
-    </w:p>
-    <w:p>
-      <w:pPr>
-        <w:bidi/>
-      </w:pPr>
-      <w:r>
-        <w:rPr>
-          <w:lang w:val="ar_AE" w:bidi="ar_AE"/>
-        </w:rPr>
-      </w:r>
-      <w:r>
-        <w:rPr>
-          <w:vertAlign w:val="superscript"/>
+    </w:p>
+    <w:p>
+      <w:pPr>
+        <w:bidi/>
+      </w:pPr>
+      <w:r>
+        <w:rPr>
+          <w:rtl/>
+          <w:cs/>
+          <w:lang w:val="ar_AE" w:bidi="ar_AE"/>
+        </w:rPr>
+      </w:r>
+      <w:r>
+        <w:rPr>
+          <w:vertAlign w:val="superscript"/>
+          <w:rtl/>
+          <w:cs/>
           <w:lang w:val="ar_AE" w:bidi="ar_AE"/>
         </w:rPr>
         <w:t>10</w:t>
       </w:r>
       <w:r>
         <w:rPr>
+          <w:rtl/>
+          <w:cs/>
           <w:lang w:val="ar_AE" w:bidi="ar_AE"/>
         </w:rPr>
         <w:t xml:space="preserve"> تَرْتَعِدُ الأَرْضُ أَمَامَهُمْ وَتَرْجُفُ السَّمَاءُ، تُظْلِمُ الشَّمْسُ وَالْقَمَرُ، وَتَكُفُّ الْكَوَاكِبُ عَنِ الضِّيَاءِ.</w:t>
       </w:r>
-      <w:r>
-        <w:rPr>
-          <w:lang w:val="ar_AE" w:bidi="ar_AE"/>
-        </w:rPr>
-      </w:r>
-      <w:r>
-        <w:rPr>
-          <w:lang w:val="ar_AE" w:bidi="ar_AE"/>
-        </w:rPr>
-      </w:r>
-    </w:p>
-    <w:p>
-      <w:pPr>
-        <w:bidi/>
-      </w:pPr>
-      <w:r>
-        <w:rPr>
-          <w:lang w:val="ar_AE" w:bidi="ar_AE"/>
-        </w:rPr>
-      </w:r>
-    </w:p>
-    <w:p>
-      <w:pPr>
-        <w:bidi/>
-      </w:pPr>
-      <w:r>
-        <w:rPr>
-          <w:lang w:val="ar_AE" w:bidi="ar_AE"/>
-        </w:rPr>
-      </w:r>
-      <w:r>
-        <w:rPr>
-          <w:vertAlign w:val="superscript"/>
+    </w:p>
+    <w:p>
+      <w:pPr>
+        <w:bidi/>
+      </w:pPr>
+      <w:r>
+        <w:rPr>
+          <w:rtl/>
+          <w:cs/>
+          <w:lang w:val="ar_AE" w:bidi="ar_AE"/>
+        </w:rPr>
+      </w:r>
+      <w:r>
+        <w:rPr>
+          <w:vertAlign w:val="superscript"/>
+          <w:rtl/>
+          <w:cs/>
           <w:lang w:val="ar_AE" w:bidi="ar_AE"/>
         </w:rPr>
         <w:t>11</w:t>
       </w:r>
       <w:r>
         <w:rPr>
+          <w:rtl/>
+          <w:cs/>
           <w:lang w:val="ar_AE" w:bidi="ar_AE"/>
         </w:rPr>
         <w:t xml:space="preserve"> يَجْهَرُ الرَّبُّ بِصَوْتِهِ فِي مُقَدَّمَةِ جَيْشِهِ لأَنَّ جُنْدَهُ لَا يُحْصَى لَهُمْ عَدَدٌ، وَمَنْ يُنَفِّذُ أَمْرَهُ يَكُونُ مُقْتَدِراً، لأَنَّ يَوْمَ الرَّبِّ عَظِيمٌ وَمُخِيفٌ جِدّاً، فَمَنْ يَتَحَمَّلُهُ؟</w:t>
       </w:r>
-      <w:r>
-        <w:rPr>
-          <w:lang w:val="ar_AE" w:bidi="ar_AE"/>
-        </w:rPr>
-      </w:r>
-      <w:r>
-        <w:rPr>
-          <w:lang w:val="ar_AE" w:bidi="ar_AE"/>
-        </w:rPr>
-      </w:r>
-    </w:p>
-    <w:p>
-      <w:pPr>
-        <w:bidi/>
-      </w:pPr>
-      <w:r>
-        <w:rPr>
-          <w:lang w:val="ar_AE" w:bidi="ar_AE"/>
-        </w:rPr>
-      </w:r>
-    </w:p>
-    <w:p>
-      <w:pPr>
-        <w:bidi/>
-      </w:pPr>
-      <w:r>
-        <w:rPr>
-          <w:lang w:val="ar_AE" w:bidi="ar_AE"/>
-        </w:rPr>
-      </w:r>
-      <w:r>
-        <w:rPr>
-          <w:vertAlign w:val="superscript"/>
+    </w:p>
+    <w:p>
+      <w:pPr>
+        <w:bidi/>
+      </w:pPr>
+      <w:r>
+        <w:rPr>
+          <w:rtl/>
+          <w:cs/>
+          <w:lang w:val="ar_AE" w:bidi="ar_AE"/>
+        </w:rPr>
+      </w:r>
+      <w:r>
+        <w:rPr>
+          <w:vertAlign w:val="superscript"/>
+          <w:rtl/>
+          <w:cs/>
           <w:lang w:val="ar_AE" w:bidi="ar_AE"/>
         </w:rPr>
         <w:t>12</w:t>
       </w:r>
       <w:r>
         <w:rPr>
+          <w:rtl/>
+          <w:cs/>
           <w:lang w:val="ar_AE" w:bidi="ar_AE"/>
         </w:rPr>
         <w:t xml:space="preserve"> وَالآنَ، يَقُولُ الرَّبُّ: ارْجِعُوا إِلَيَّ مِنْ كُلِّ قُلُوبِكُمْ بِصَوْمٍ وَبُكَاءٍ وَنَوْحٍ.</w:t>
       </w:r>
-      <w:r>
-        <w:rPr>
-          <w:lang w:val="ar_AE" w:bidi="ar_AE"/>
-        </w:rPr>
-      </w:r>
-      <w:r>
-        <w:rPr>
-          <w:lang w:val="ar_AE" w:bidi="ar_AE"/>
-        </w:rPr>
-      </w:r>
-    </w:p>
-    <w:p>
-      <w:pPr>
-        <w:bidi/>
-      </w:pPr>
-      <w:r>
-        <w:rPr>
-          <w:lang w:val="ar_AE" w:bidi="ar_AE"/>
-        </w:rPr>
-      </w:r>
-    </w:p>
-    <w:p>
-      <w:pPr>
-        <w:bidi/>
-      </w:pPr>
-      <w:r>
-        <w:rPr>
-          <w:lang w:val="ar_AE" w:bidi="ar_AE"/>
-        </w:rPr>
-      </w:r>
-      <w:r>
-        <w:rPr>
-          <w:vertAlign w:val="superscript"/>
+    </w:p>
+    <w:p>
+      <w:pPr>
+        <w:bidi/>
+      </w:pPr>
+      <w:r>
+        <w:rPr>
+          <w:rtl/>
+          <w:cs/>
+          <w:lang w:val="ar_AE" w:bidi="ar_AE"/>
+        </w:rPr>
+      </w:r>
+      <w:r>
+        <w:rPr>
+          <w:vertAlign w:val="superscript"/>
+          <w:rtl/>
+          <w:cs/>
           <w:lang w:val="ar_AE" w:bidi="ar_AE"/>
         </w:rPr>
         <w:t>13</w:t>
       </w:r>
       <w:r>
         <w:rPr>
+          <w:rtl/>
+          <w:cs/>
           <w:lang w:val="ar_AE" w:bidi="ar_AE"/>
         </w:rPr>
         <w:t xml:space="preserve"> مَزِّقُوا قُلُوبَكُمْ لَا ثِيَابَكُمْ. ارْجِعُوا إِلَى الرَّبِّ إِلَهِكُمْ لأَنَّهُ رَؤُوفٌ وَرَحِيمٌ بَطِيءُ الْغَضَبِ وَكَثِيرُ الرَّأْفَةِ، وَلا يُسَرُّ بِالْعِقَابِ.</w:t>
       </w:r>
-      <w:r>
-        <w:rPr>
-          <w:lang w:val="ar_AE" w:bidi="ar_AE"/>
-        </w:rPr>
-      </w:r>
-      <w:r>
-        <w:rPr>
-          <w:lang w:val="ar_AE" w:bidi="ar_AE"/>
-        </w:rPr>
-      </w:r>
-    </w:p>
-    <w:p>
-      <w:pPr>
-        <w:bidi/>
-      </w:pPr>
-      <w:r>
-        <w:rPr>
-          <w:lang w:val="ar_AE" w:bidi="ar_AE"/>
-        </w:rPr>
-      </w:r>
-    </w:p>
-    <w:p>
-      <w:pPr>
-        <w:bidi/>
-      </w:pPr>
-      <w:r>
-        <w:rPr>
-          <w:lang w:val="ar_AE" w:bidi="ar_AE"/>
-        </w:rPr>
-      </w:r>
-      <w:r>
-        <w:rPr>
-          <w:vertAlign w:val="superscript"/>
+    </w:p>
+    <w:p>
+      <w:pPr>
+        <w:bidi/>
+      </w:pPr>
+      <w:r>
+        <w:rPr>
+          <w:rtl/>
+          <w:cs/>
+          <w:lang w:val="ar_AE" w:bidi="ar_AE"/>
+        </w:rPr>
+      </w:r>
+      <w:r>
+        <w:rPr>
+          <w:vertAlign w:val="superscript"/>
+          <w:rtl/>
+          <w:cs/>
           <w:lang w:val="ar_AE" w:bidi="ar_AE"/>
         </w:rPr>
         <w:t>14</w:t>
       </w:r>
       <w:r>
         <w:rPr>
+          <w:rtl/>
+          <w:cs/>
           <w:lang w:val="ar_AE" w:bidi="ar_AE"/>
         </w:rPr>
         <w:t xml:space="preserve"> لَعَلَّهُ يَرْجِعُ وَيَكُفُّ عَنِ الْعِقَابِ مُخْلِفاً وَرَاءَهُ بَرَكَةً: تَقْدِمَةَ دَقِيقٍ وَتَقْدِمَةَ سَكِيبٍ لِتُقَرِّبُوهُمَا لِلرَّبِّ إِلَهِكُمْ.</w:t>
       </w:r>
-      <w:r>
-        <w:rPr>
-          <w:lang w:val="ar_AE" w:bidi="ar_AE"/>
-        </w:rPr>
-      </w:r>
-      <w:r>
-        <w:rPr>
-          <w:lang w:val="ar_AE" w:bidi="ar_AE"/>
-        </w:rPr>
-      </w:r>
-    </w:p>
-    <w:p>
-      <w:pPr>
-        <w:bidi/>
-      </w:pPr>
-      <w:r>
-        <w:rPr>
-          <w:lang w:val="ar_AE" w:bidi="ar_AE"/>
-        </w:rPr>
-      </w:r>
-    </w:p>
-    <w:p>
-      <w:pPr>
-        <w:bidi/>
-      </w:pPr>
-      <w:r>
-        <w:rPr>
-          <w:lang w:val="ar_AE" w:bidi="ar_AE"/>
-        </w:rPr>
-      </w:r>
-      <w:r>
-        <w:rPr>
-          <w:vertAlign w:val="superscript"/>
+    </w:p>
+    <w:p>
+      <w:pPr>
+        <w:bidi/>
+      </w:pPr>
+      <w:r>
+        <w:rPr>
+          <w:rtl/>
+          <w:cs/>
+          <w:lang w:val="ar_AE" w:bidi="ar_AE"/>
+        </w:rPr>
+      </w:r>
+      <w:r>
+        <w:rPr>
+          <w:vertAlign w:val="superscript"/>
+          <w:rtl/>
+          <w:cs/>
           <w:lang w:val="ar_AE" w:bidi="ar_AE"/>
         </w:rPr>
         <w:t>15</w:t>
       </w:r>
       <w:r>
         <w:rPr>
+          <w:rtl/>
+          <w:cs/>
           <w:lang w:val="ar_AE" w:bidi="ar_AE"/>
         </w:rPr>
         <w:t xml:space="preserve"> انْفُخُوا بِالْبُوقِ فِي صِهْيَوْنَ، وَقَدِّسُوا صَوْماً، وَنَادُوا لِمَحْفَلٍ مُقَدَّسٍ.</w:t>
       </w:r>
-      <w:r>
-        <w:rPr>
-          <w:lang w:val="ar_AE" w:bidi="ar_AE"/>
-        </w:rPr>
-      </w:r>
-      <w:r>
-        <w:rPr>
-          <w:lang w:val="ar_AE" w:bidi="ar_AE"/>
-        </w:rPr>
-      </w:r>
-    </w:p>
-    <w:p>
-      <w:pPr>
-        <w:bidi/>
-      </w:pPr>
-      <w:r>
-        <w:rPr>
-          <w:lang w:val="ar_AE" w:bidi="ar_AE"/>
-        </w:rPr>
-      </w:r>
-    </w:p>
-    <w:p>
-      <w:pPr>
-        <w:bidi/>
-      </w:pPr>
-      <w:r>
-        <w:rPr>
-          <w:lang w:val="ar_AE" w:bidi="ar_AE"/>
-        </w:rPr>
-      </w:r>
-      <w:r>
-        <w:rPr>
-          <w:vertAlign w:val="superscript"/>
+    </w:p>
+    <w:p>
+      <w:pPr>
+        <w:bidi/>
+      </w:pPr>
+      <w:r>
+        <w:rPr>
+          <w:rtl/>
+          <w:cs/>
+          <w:lang w:val="ar_AE" w:bidi="ar_AE"/>
+        </w:rPr>
+      </w:r>
+      <w:r>
+        <w:rPr>
+          <w:vertAlign w:val="superscript"/>
+          <w:rtl/>
+          <w:cs/>
           <w:lang w:val="ar_AE" w:bidi="ar_AE"/>
         </w:rPr>
         <w:t>16</w:t>
       </w:r>
       <w:r>
         <w:rPr>
+          <w:rtl/>
+          <w:cs/>
           <w:lang w:val="ar_AE" w:bidi="ar_AE"/>
         </w:rPr>
         <w:t xml:space="preserve"> اجْمَعُوا الشَّعْبَ، قَدِّسُوا الْجَمَاعَةَ، احْشُدُوا الشُّيُوخَ وَالأَوْلادَ وَالرُّضَّعَ. لِيُغَادِرِ الْعَرِيسُ مُخْدَعَهُ وَالْعَرُوسُ حُجْرَتَهَا.</w:t>
       </w:r>
-      <w:r>
-        <w:rPr>
-          <w:lang w:val="ar_AE" w:bidi="ar_AE"/>
-        </w:rPr>
-      </w:r>
-      <w:r>
-        <w:rPr>
-          <w:lang w:val="ar_AE" w:bidi="ar_AE"/>
-        </w:rPr>
-      </w:r>
-    </w:p>
-    <w:p>
-      <w:pPr>
-        <w:bidi/>
-      </w:pPr>
-      <w:r>
-        <w:rPr>
-          <w:lang w:val="ar_AE" w:bidi="ar_AE"/>
-        </w:rPr>
-      </w:r>
-    </w:p>
-    <w:p>
-      <w:pPr>
-        <w:bidi/>
-      </w:pPr>
-      <w:r>
-        <w:rPr>
-          <w:lang w:val="ar_AE" w:bidi="ar_AE"/>
-        </w:rPr>
-      </w:r>
-      <w:r>
-        <w:rPr>
-          <w:vertAlign w:val="superscript"/>
+    </w:p>
+    <w:p>
+      <w:pPr>
+        <w:bidi/>
+      </w:pPr>
+      <w:r>
+        <w:rPr>
+          <w:rtl/>
+          <w:cs/>
+          <w:lang w:val="ar_AE" w:bidi="ar_AE"/>
+        </w:rPr>
+      </w:r>
+      <w:r>
+        <w:rPr>
+          <w:vertAlign w:val="superscript"/>
+          <w:rtl/>
+          <w:cs/>
           <w:lang w:val="ar_AE" w:bidi="ar_AE"/>
         </w:rPr>
         <w:t>17</w:t>
       </w:r>
       <w:r>
         <w:rPr>
+          <w:rtl/>
+          <w:cs/>
           <w:lang w:val="ar_AE" w:bidi="ar_AE"/>
         </w:rPr>
         <w:t xml:space="preserve"> لِيَبْكِ الْكَهَنَةُ خُدَّامُ الرَّبِّ بَيْنَ الرُّوَاقِ وَالْمَذْبَحِ قَائِلِينَ: «اعْفُ عَنْ شَعْبِكَ يَا رَبُّ وَلا تَجْعَلْ مِيرَاثَكَ مَثَارَ احْتِقَارٍ وَهُزْءٍ بَيْنَ الأُمَمِ، فَيَقُولُوا بَيْنَ الشُّعُوبِ: أَيْنَ إِلَهُهُمْ؟»</w:t>
       </w:r>
-      <w:r>
-        <w:rPr>
-          <w:lang w:val="ar_AE" w:bidi="ar_AE"/>
-        </w:rPr>
-      </w:r>
-      <w:r>
-        <w:rPr>
-          <w:lang w:val="ar_AE" w:bidi="ar_AE"/>
-        </w:rPr>
-      </w:r>
-    </w:p>
-    <w:p>
-      <w:pPr>
-        <w:bidi/>
-      </w:pPr>
-      <w:r>
-        <w:rPr>
-          <w:lang w:val="ar_AE" w:bidi="ar_AE"/>
-        </w:rPr>
-      </w:r>
-    </w:p>
-    <w:p>
-      <w:pPr>
-        <w:bidi/>
-      </w:pPr>
-      <w:r>
-        <w:rPr>
-          <w:lang w:val="ar_AE" w:bidi="ar_AE"/>
-        </w:rPr>
-      </w:r>
-      <w:r>
-        <w:rPr>
-          <w:vertAlign w:val="superscript"/>
+    </w:p>
+    <w:p>
+      <w:pPr>
+        <w:bidi/>
+      </w:pPr>
+      <w:r>
+        <w:rPr>
+          <w:rtl/>
+          <w:cs/>
+          <w:lang w:val="ar_AE" w:bidi="ar_AE"/>
+        </w:rPr>
+      </w:r>
+      <w:r>
+        <w:rPr>
+          <w:vertAlign w:val="superscript"/>
+          <w:rtl/>
+          <w:cs/>
           <w:lang w:val="ar_AE" w:bidi="ar_AE"/>
         </w:rPr>
         <w:t>18</w:t>
       </w:r>
       <w:r>
         <w:rPr>
+          <w:rtl/>
+          <w:cs/>
           <w:lang w:val="ar_AE" w:bidi="ar_AE"/>
         </w:rPr>
         <w:t xml:space="preserve"> عِنْدَئِذٍ يَغَارُ الرَّبُّ عَلَى أَرْضِهِ ويَرِقُّ لِشَعْبِهِ.</w:t>
       </w:r>
-      <w:r>
-        <w:rPr>
-          <w:lang w:val="ar_AE" w:bidi="ar_AE"/>
-        </w:rPr>
-      </w:r>
-      <w:r>
-        <w:rPr>
-          <w:lang w:val="ar_AE" w:bidi="ar_AE"/>
-        </w:rPr>
-      </w:r>
-    </w:p>
-    <w:p>
-      <w:pPr>
-        <w:bidi/>
-      </w:pPr>
-      <w:r>
-        <w:rPr>
-          <w:lang w:val="ar_AE" w:bidi="ar_AE"/>
-        </w:rPr>
-      </w:r>
-    </w:p>
-    <w:p>
-      <w:pPr>
-        <w:bidi/>
-      </w:pPr>
-      <w:r>
-        <w:rPr>
-          <w:lang w:val="ar_AE" w:bidi="ar_AE"/>
-        </w:rPr>
-      </w:r>
-      <w:r>
-        <w:rPr>
-          <w:vertAlign w:val="superscript"/>
+    </w:p>
+    <w:p>
+      <w:pPr>
+        <w:bidi/>
+      </w:pPr>
+      <w:r>
+        <w:rPr>
+          <w:rtl/>
+          <w:cs/>
+          <w:lang w:val="ar_AE" w:bidi="ar_AE"/>
+        </w:rPr>
+      </w:r>
+      <w:r>
+        <w:rPr>
+          <w:vertAlign w:val="superscript"/>
+          <w:rtl/>
+          <w:cs/>
           <w:lang w:val="ar_AE" w:bidi="ar_AE"/>
         </w:rPr>
         <w:t>19</w:t>
       </w:r>
       <w:r>
         <w:rPr>
+          <w:rtl/>
+          <w:cs/>
           <w:lang w:val="ar_AE" w:bidi="ar_AE"/>
         </w:rPr>
         <w:t xml:space="preserve"> وَيُجِيبُهُمْ قَائِلاً: هَا أَنَا أُنْعِمُ عَلَيْكُمْ بِالْحِنْطَةِ وَالْخَمْرَةِ وَالزَّيْتِ فَتَشْبَعُونَ مِنْهَا، وَلا أَجْعَلُكُمْ مِنْ بَعْدُ عَاراً بَيْنَ الأُمَمِ.</w:t>
       </w:r>
-      <w:r>
-        <w:rPr>
-          <w:lang w:val="ar_AE" w:bidi="ar_AE"/>
-        </w:rPr>
-      </w:r>
-      <w:r>
-        <w:rPr>
-          <w:lang w:val="ar_AE" w:bidi="ar_AE"/>
-        </w:rPr>
-      </w:r>
-    </w:p>
-    <w:p>
-      <w:pPr>
-        <w:bidi/>
-      </w:pPr>
-      <w:r>
-        <w:rPr>
-          <w:lang w:val="ar_AE" w:bidi="ar_AE"/>
-        </w:rPr>
-      </w:r>
-    </w:p>
-    <w:p>
-      <w:pPr>
-        <w:bidi/>
-      </w:pPr>
-      <w:r>
-        <w:rPr>
-          <w:lang w:val="ar_AE" w:bidi="ar_AE"/>
-        </w:rPr>
-      </w:r>
-      <w:r>
-        <w:rPr>
-          <w:vertAlign w:val="superscript"/>
+    </w:p>
+    <w:p>
+      <w:pPr>
+        <w:bidi/>
+      </w:pPr>
+      <w:r>
+        <w:rPr>
+          <w:rtl/>
+          <w:cs/>
+          <w:lang w:val="ar_AE" w:bidi="ar_AE"/>
+        </w:rPr>
+      </w:r>
+      <w:r>
+        <w:rPr>
+          <w:vertAlign w:val="superscript"/>
+          <w:rtl/>
+          <w:cs/>
           <w:lang w:val="ar_AE" w:bidi="ar_AE"/>
         </w:rPr>
         <w:t>20</w:t>
       </w:r>
       <w:r>
         <w:rPr>
+          <w:rtl/>
+          <w:cs/>
           <w:lang w:val="ar_AE" w:bidi="ar_AE"/>
         </w:rPr>
         <w:t xml:space="preserve"> سَأَطْرُدُ عَنْكُمُ الشِّمَالِيَّ، وَأَطُوِّحُ بِهِ إِلَى أَرْضٍ مُقْفِرَةٍ مُوْحِشَةٍ فَتَكُونُ طَلِيعَتُهُ فِي الْبَحْرِ الْمَيْتِ وَمُؤَخِّرَتُهُ فِي الْبَحْرِ الأَبْيَضِ، فَتَمْلأُ رَائِحَةُ نَتَنِهِ وَعُفُونَتِهِ الْفَضَاءَ، لأَنَّهُ قَدِ ارْتَكَبَ الْكَبَائِرَ.</w:t>
       </w:r>
-      <w:r>
-        <w:rPr>
-          <w:lang w:val="ar_AE" w:bidi="ar_AE"/>
-        </w:rPr>
-      </w:r>
-      <w:r>
-        <w:rPr>
-          <w:lang w:val="ar_AE" w:bidi="ar_AE"/>
-        </w:rPr>
-      </w:r>
-    </w:p>
-    <w:p>
-      <w:pPr>
-        <w:bidi/>
-      </w:pPr>
-      <w:r>
-        <w:rPr>
-          <w:lang w:val="ar_AE" w:bidi="ar_AE"/>
-        </w:rPr>
-      </w:r>
-    </w:p>
-    <w:p>
-      <w:pPr>
-        <w:bidi/>
-      </w:pPr>
-      <w:r>
-        <w:rPr>
-          <w:lang w:val="ar_AE" w:bidi="ar_AE"/>
-        </w:rPr>
-      </w:r>
-      <w:r>
-        <w:rPr>
-          <w:vertAlign w:val="superscript"/>
+    </w:p>
+    <w:p>
+      <w:pPr>
+        <w:bidi/>
+      </w:pPr>
+      <w:r>
+        <w:rPr>
+          <w:rtl/>
+          <w:cs/>
+          <w:lang w:val="ar_AE" w:bidi="ar_AE"/>
+        </w:rPr>
+      </w:r>
+      <w:r>
+        <w:rPr>
+          <w:vertAlign w:val="superscript"/>
+          <w:rtl/>
+          <w:cs/>
           <w:lang w:val="ar_AE" w:bidi="ar_AE"/>
         </w:rPr>
         <w:t>21</w:t>
       </w:r>
       <w:r>
         <w:rPr>
+          <w:rtl/>
+          <w:cs/>
           <w:lang w:val="ar_AE" w:bidi="ar_AE"/>
         </w:rPr>
         <w:t xml:space="preserve"> لَا تَخَافِي أَيَّتُهَا الأَرْضُ، ابْتَهِجِي وَافْرَحِي لأَنَّ الرَّبَّ قَدْ صَنَعَ عَظَائِمَ.</w:t>
       </w:r>
-      <w:r>
-        <w:rPr>
-          <w:lang w:val="ar_AE" w:bidi="ar_AE"/>
-        </w:rPr>
-      </w:r>
-      <w:r>
-        <w:rPr>
-          <w:lang w:val="ar_AE" w:bidi="ar_AE"/>
-        </w:rPr>
-      </w:r>
-    </w:p>
-    <w:p>
-      <w:pPr>
-        <w:bidi/>
-      </w:pPr>
-      <w:r>
-        <w:rPr>
-          <w:lang w:val="ar_AE" w:bidi="ar_AE"/>
-        </w:rPr>
-      </w:r>
-    </w:p>
-    <w:p>
-      <w:pPr>
-        <w:bidi/>
-      </w:pPr>
-      <w:r>
-        <w:rPr>
-          <w:lang w:val="ar_AE" w:bidi="ar_AE"/>
-        </w:rPr>
-      </w:r>
-      <w:r>
-        <w:rPr>
-          <w:vertAlign w:val="superscript"/>
+    </w:p>
+    <w:p>
+      <w:pPr>
+        <w:bidi/>
+      </w:pPr>
+      <w:r>
+        <w:rPr>
+          <w:rtl/>
+          <w:cs/>
+          <w:lang w:val="ar_AE" w:bidi="ar_AE"/>
+        </w:rPr>
+      </w:r>
+      <w:r>
+        <w:rPr>
+          <w:vertAlign w:val="superscript"/>
+          <w:rtl/>
+          <w:cs/>
           <w:lang w:val="ar_AE" w:bidi="ar_AE"/>
         </w:rPr>
         <w:t>22</w:t>
       </w:r>
       <w:r>
         <w:rPr>
+          <w:rtl/>
+          <w:cs/>
           <w:lang w:val="ar_AE" w:bidi="ar_AE"/>
         </w:rPr>
         <w:t xml:space="preserve"> لَا تَخَافِي يَا بَهَائِمَ الْحَقْلِ، لأَنَّ مَرَاعِيَ الْبَرِّ قَدْ أَضْحَتْ خَضْرَاءَ، وَالأَشْجَارَ بَاتَتْ مُثَقَّلَةً بِالثِّمَارِ، وَشَجَرَةَ التِّينِ وَالْكَرْمَةَ تَجُودَانِ بِنِتَاجِهِمَا.</w:t>
       </w:r>
-      <w:r>
-        <w:rPr>
-          <w:lang w:val="ar_AE" w:bidi="ar_AE"/>
-        </w:rPr>
-      </w:r>
-      <w:r>
-        <w:rPr>
-          <w:lang w:val="ar_AE" w:bidi="ar_AE"/>
-        </w:rPr>
-      </w:r>
-    </w:p>
-    <w:p>
-      <w:pPr>
-        <w:bidi/>
-      </w:pPr>
-      <w:r>
-        <w:rPr>
-          <w:lang w:val="ar_AE" w:bidi="ar_AE"/>
-        </w:rPr>
-      </w:r>
-    </w:p>
-    <w:p>
-      <w:pPr>
-        <w:bidi/>
-      </w:pPr>
-      <w:r>
-        <w:rPr>
-          <w:lang w:val="ar_AE" w:bidi="ar_AE"/>
-        </w:rPr>
-      </w:r>
-      <w:r>
-        <w:rPr>
-          <w:vertAlign w:val="superscript"/>
+    </w:p>
+    <w:p>
+      <w:pPr>
+        <w:bidi/>
+      </w:pPr>
+      <w:r>
+        <w:rPr>
+          <w:rtl/>
+          <w:cs/>
+          <w:lang w:val="ar_AE" w:bidi="ar_AE"/>
+        </w:rPr>
+      </w:r>
+      <w:r>
+        <w:rPr>
+          <w:vertAlign w:val="superscript"/>
+          <w:rtl/>
+          <w:cs/>
           <w:lang w:val="ar_AE" w:bidi="ar_AE"/>
         </w:rPr>
         <w:t>23</w:t>
       </w:r>
       <w:r>
         <w:rPr>
+          <w:rtl/>
+          <w:cs/>
           <w:lang w:val="ar_AE" w:bidi="ar_AE"/>
         </w:rPr>
         <w:t xml:space="preserve"> افْرَحُوا يَا أَبْنَاءَ صِهْيَوْنَ، ابْتَهِجُوا بِالرَّبِّ إِلَهِكُمْ لأَنَّهُ أَنْعَمَ عَلَيْكُمْ بِفَضْلِ صَلاحِهِ بِأَمْطَارِ الْخَرِيفِ، وَسَكَبَ عَلَيْكُمُ الْغَيْثَ الْمُبَكِّرَ وَالْمُتَأَخِّرَ بِغَزَارَةٍ، كَالسَّابِقِ.</w:t>
       </w:r>
-      <w:r>
-        <w:rPr>
-          <w:lang w:val="ar_AE" w:bidi="ar_AE"/>
-        </w:rPr>
-      </w:r>
-      <w:r>
-        <w:rPr>
-          <w:lang w:val="ar_AE" w:bidi="ar_AE"/>
-        </w:rPr>
-      </w:r>
-    </w:p>
-    <w:p>
-      <w:pPr>
-        <w:bidi/>
-      </w:pPr>
-      <w:r>
-        <w:rPr>
-          <w:lang w:val="ar_AE" w:bidi="ar_AE"/>
-        </w:rPr>
-      </w:r>
-    </w:p>
-    <w:p>
-      <w:pPr>
-        <w:bidi/>
-      </w:pPr>
-      <w:r>
-        <w:rPr>
-          <w:lang w:val="ar_AE" w:bidi="ar_AE"/>
-        </w:rPr>
-      </w:r>
-      <w:r>
-        <w:rPr>
-          <w:vertAlign w:val="superscript"/>
+    </w:p>
+    <w:p>
+      <w:pPr>
+        <w:bidi/>
+      </w:pPr>
+      <w:r>
+        <w:rPr>
+          <w:rtl/>
+          <w:cs/>
+          <w:lang w:val="ar_AE" w:bidi="ar_AE"/>
+        </w:rPr>
+      </w:r>
+      <w:r>
+        <w:rPr>
+          <w:vertAlign w:val="superscript"/>
+          <w:rtl/>
+          <w:cs/>
           <w:lang w:val="ar_AE" w:bidi="ar_AE"/>
         </w:rPr>
         <w:t>24</w:t>
       </w:r>
       <w:r>
         <w:rPr>
+          <w:rtl/>
+          <w:cs/>
           <w:lang w:val="ar_AE" w:bidi="ar_AE"/>
         </w:rPr>
         <w:t xml:space="preserve"> فَتَمْتَلِئُ الْبَيَادِرُ بِأَكْوَامِ الْقَمْحِ، وَتَتَدَفَّقُ الْمَعَاصِرُ بِالْخَمْرَةِ وَالزَّيْتِ.</w:t>
       </w:r>
-      <w:r>
-        <w:rPr>
-          <w:lang w:val="ar_AE" w:bidi="ar_AE"/>
-        </w:rPr>
-      </w:r>
-      <w:r>
-        <w:rPr>
-          <w:lang w:val="ar_AE" w:bidi="ar_AE"/>
-        </w:rPr>
-      </w:r>
-    </w:p>
-    <w:p>
-      <w:pPr>
-        <w:bidi/>
-      </w:pPr>
-      <w:r>
-        <w:rPr>
-          <w:lang w:val="ar_AE" w:bidi="ar_AE"/>
-        </w:rPr>
-      </w:r>
-    </w:p>
-    <w:p>
-      <w:pPr>
-        <w:bidi/>
-      </w:pPr>
-      <w:r>
-        <w:rPr>
-          <w:lang w:val="ar_AE" w:bidi="ar_AE"/>
-        </w:rPr>
-      </w:r>
-      <w:r>
-        <w:rPr>
-          <w:vertAlign w:val="superscript"/>
+    </w:p>
+    <w:p>
+      <w:pPr>
+        <w:bidi/>
+      </w:pPr>
+      <w:r>
+        <w:rPr>
+          <w:rtl/>
+          <w:cs/>
+          <w:lang w:val="ar_AE" w:bidi="ar_AE"/>
+        </w:rPr>
+      </w:r>
+      <w:r>
+        <w:rPr>
+          <w:vertAlign w:val="superscript"/>
+          <w:rtl/>
+          <w:cs/>
           <w:lang w:val="ar_AE" w:bidi="ar_AE"/>
         </w:rPr>
         <w:t>25</w:t>
       </w:r>
       <w:r>
         <w:rPr>
+          <w:rtl/>
+          <w:cs/>
           <w:lang w:val="ar_AE" w:bidi="ar_AE"/>
         </w:rPr>
         <w:t xml:space="preserve"> وَأُعَوِّضُكُمْ عَنْ مَحَاصِيلِ السِّنِينَ الَّتِي الْتَهَمَهَا الْجَرَادُ وَالْجَنْدُبُ وَالطَّيَّارُ وَالْقَمَصُ، جَيْشِي الْعَظِيمُ الَّذِي أَطْلَقْتُهُ عَلَيْكُمْ.</w:t>
       </w:r>
-      <w:r>
-        <w:rPr>
-          <w:lang w:val="ar_AE" w:bidi="ar_AE"/>
-        </w:rPr>
-      </w:r>
-      <w:r>
-        <w:rPr>
-          <w:lang w:val="ar_AE" w:bidi="ar_AE"/>
-        </w:rPr>
-      </w:r>
-    </w:p>
-    <w:p>
-      <w:pPr>
-        <w:bidi/>
-      </w:pPr>
-      <w:r>
-        <w:rPr>
-          <w:lang w:val="ar_AE" w:bidi="ar_AE"/>
-        </w:rPr>
-      </w:r>
-    </w:p>
-    <w:p>
-      <w:pPr>
-        <w:bidi/>
-      </w:pPr>
-      <w:r>
-        <w:rPr>
-          <w:lang w:val="ar_AE" w:bidi="ar_AE"/>
-        </w:rPr>
-      </w:r>
-      <w:r>
-        <w:rPr>
-          <w:vertAlign w:val="superscript"/>
+    </w:p>
+    <w:p>
+      <w:pPr>
+        <w:bidi/>
+      </w:pPr>
+      <w:r>
+        <w:rPr>
+          <w:rtl/>
+          <w:cs/>
+          <w:lang w:val="ar_AE" w:bidi="ar_AE"/>
+        </w:rPr>
+      </w:r>
+      <w:r>
+        <w:rPr>
+          <w:vertAlign w:val="superscript"/>
+          <w:rtl/>
+          <w:cs/>
           <w:lang w:val="ar_AE" w:bidi="ar_AE"/>
         </w:rPr>
         <w:t>26</w:t>
       </w:r>
       <w:r>
         <w:rPr>
+          <w:rtl/>
+          <w:cs/>
           <w:lang w:val="ar_AE" w:bidi="ar_AE"/>
         </w:rPr>
         <w:t xml:space="preserve"> فَتَأْكُلُونَ بِوَفْرَةٍ وَتَشْبَعُونَ وَتُسَبِّحُونَ اسْمَ الرَّبِّ إِلَهِكُمُ الَّذِي أَجْرَى لَكُمُ الْعَجَائِبَ، وَلَنْ يَخْزَى شَعْبِي ثَانِيَةً.</w:t>
       </w:r>
-      <w:r>
-        <w:rPr>
-          <w:lang w:val="ar_AE" w:bidi="ar_AE"/>
-        </w:rPr>
-      </w:r>
-      <w:r>
-        <w:rPr>
-          <w:lang w:val="ar_AE" w:bidi="ar_AE"/>
-        </w:rPr>
-      </w:r>
-    </w:p>
-    <w:p>
-      <w:pPr>
-        <w:bidi/>
-      </w:pPr>
-      <w:r>
-        <w:rPr>
-          <w:lang w:val="ar_AE" w:bidi="ar_AE"/>
-        </w:rPr>
-      </w:r>
-    </w:p>
-    <w:p>
-      <w:pPr>
-        <w:bidi/>
-      </w:pPr>
-      <w:r>
-        <w:rPr>
-          <w:lang w:val="ar_AE" w:bidi="ar_AE"/>
-        </w:rPr>
-      </w:r>
-      <w:r>
-        <w:rPr>
-          <w:vertAlign w:val="superscript"/>
+    </w:p>
+    <w:p>
+      <w:pPr>
+        <w:bidi/>
+      </w:pPr>
+      <w:r>
+        <w:rPr>
+          <w:rtl/>
+          <w:cs/>
+          <w:lang w:val="ar_AE" w:bidi="ar_AE"/>
+        </w:rPr>
+      </w:r>
+      <w:r>
+        <w:rPr>
+          <w:vertAlign w:val="superscript"/>
+          <w:rtl/>
+          <w:cs/>
           <w:lang w:val="ar_AE" w:bidi="ar_AE"/>
         </w:rPr>
         <w:t>27</w:t>
       </w:r>
       <w:r>
         <w:rPr>
+          <w:rtl/>
+          <w:cs/>
           <w:lang w:val="ar_AE" w:bidi="ar_AE"/>
         </w:rPr>
         <w:t xml:space="preserve"> فَتُدْرِكُونَ أَنِّي فِي وَسَطِ إِسْرَائِيلَ، وَأَنِّي أَنَا هُوَ الرَّبُّ إِلَهُكُمْ وَلَيْسَ غَيْرِي، وَلَنْ يَخْزَى شَعْبِي ثَانِيَةً.</w:t>
       </w:r>
-      <w:r>
-        <w:rPr>
-          <w:lang w:val="ar_AE" w:bidi="ar_AE"/>
-        </w:rPr>
-      </w:r>
-      <w:r>
-        <w:rPr>
-          <w:lang w:val="ar_AE" w:bidi="ar_AE"/>
-        </w:rPr>
-      </w:r>
-    </w:p>
-    <w:p>
-      <w:pPr>
-        <w:bidi/>
-      </w:pPr>
-      <w:r>
-        <w:rPr>
-          <w:lang w:val="ar_AE" w:bidi="ar_AE"/>
-        </w:rPr>
-      </w:r>
-    </w:p>
-    <w:p>
-      <w:pPr>
-        <w:bidi/>
-      </w:pPr>
-      <w:r>
-        <w:rPr>
-          <w:lang w:val="ar_AE" w:bidi="ar_AE"/>
-        </w:rPr>
-      </w:r>
-      <w:r>
-        <w:rPr>
-          <w:vertAlign w:val="superscript"/>
+    </w:p>
+    <w:p>
+      <w:pPr>
+        <w:bidi/>
+      </w:pPr>
+      <w:r>
+        <w:rPr>
+          <w:rtl/>
+          <w:cs/>
+          <w:lang w:val="ar_AE" w:bidi="ar_AE"/>
+        </w:rPr>
+      </w:r>
+      <w:r>
+        <w:rPr>
+          <w:vertAlign w:val="superscript"/>
+          <w:rtl/>
+          <w:cs/>
           <w:lang w:val="ar_AE" w:bidi="ar_AE"/>
         </w:rPr>
         <w:t>28</w:t>
       </w:r>
       <w:r>
         <w:rPr>
+          <w:rtl/>
+          <w:cs/>
           <w:lang w:val="ar_AE" w:bidi="ar_AE"/>
         </w:rPr>
         <w:t xml:space="preserve"> ثُمَّ أَسْكُبُ رُوحِي عَلَى كُلِّ بَشَرٍ، فَيَتَنَبَّأُ أَبْنَاؤُكُمْ وَبَنَاتُكُمْ، وَيَحْلَمُ شُيُوخُكُمْ أَحْلاماً وَيَرَى شَبَابُكُمْ رُؤىً.</w:t>
       </w:r>
-      <w:r>
-        <w:rPr>
-          <w:lang w:val="ar_AE" w:bidi="ar_AE"/>
-        </w:rPr>
-      </w:r>
-      <w:r>
-        <w:rPr>
-          <w:lang w:val="ar_AE" w:bidi="ar_AE"/>
-        </w:rPr>
-      </w:r>
-    </w:p>
-    <w:p>
-      <w:pPr>
-        <w:bidi/>
-      </w:pPr>
-      <w:r>
-        <w:rPr>
-          <w:lang w:val="ar_AE" w:bidi="ar_AE"/>
-        </w:rPr>
-      </w:r>
-    </w:p>
-    <w:p>
-      <w:pPr>
-        <w:bidi/>
-      </w:pPr>
-      <w:r>
-        <w:rPr>
-          <w:lang w:val="ar_AE" w:bidi="ar_AE"/>
-        </w:rPr>
-      </w:r>
-      <w:r>
-        <w:rPr>
-          <w:vertAlign w:val="superscript"/>
+    </w:p>
+    <w:p>
+      <w:pPr>
+        <w:bidi/>
+      </w:pPr>
+      <w:r>
+        <w:rPr>
+          <w:rtl/>
+          <w:cs/>
+          <w:lang w:val="ar_AE" w:bidi="ar_AE"/>
+        </w:rPr>
+      </w:r>
+      <w:r>
+        <w:rPr>
+          <w:vertAlign w:val="superscript"/>
+          <w:rtl/>
+          <w:cs/>
           <w:lang w:val="ar_AE" w:bidi="ar_AE"/>
         </w:rPr>
         <w:t>29</w:t>
       </w:r>
       <w:r>
         <w:rPr>
+          <w:rtl/>
+          <w:cs/>
           <w:lang w:val="ar_AE" w:bidi="ar_AE"/>
         </w:rPr>
         <w:t xml:space="preserve"> وَأَسْكُبُ فِي تِلْكَ الأَيَّامِ أَيْضاً رُوحِي عَلَى الْعَبِيدِ وَالإِمَاءِ.</w:t>
       </w:r>
-      <w:r>
-        <w:rPr>
-          <w:lang w:val="ar_AE" w:bidi="ar_AE"/>
-        </w:rPr>
-      </w:r>
-      <w:r>
-        <w:rPr>
-          <w:lang w:val="ar_AE" w:bidi="ar_AE"/>
-        </w:rPr>
-      </w:r>
-    </w:p>
-    <w:p>
-      <w:pPr>
-        <w:bidi/>
-      </w:pPr>
-      <w:r>
-        <w:rPr>
-          <w:lang w:val="ar_AE" w:bidi="ar_AE"/>
-        </w:rPr>
-      </w:r>
-    </w:p>
-    <w:p>
-      <w:pPr>
-        <w:bidi/>
-      </w:pPr>
-      <w:r>
-        <w:rPr>
-          <w:lang w:val="ar_AE" w:bidi="ar_AE"/>
-        </w:rPr>
-      </w:r>
-      <w:r>
-        <w:rPr>
-          <w:vertAlign w:val="superscript"/>
+    </w:p>
+    <w:p>
+      <w:pPr>
+        <w:bidi/>
+      </w:pPr>
+      <w:r>
+        <w:rPr>
+          <w:rtl/>
+          <w:cs/>
+          <w:lang w:val="ar_AE" w:bidi="ar_AE"/>
+        </w:rPr>
+      </w:r>
+      <w:r>
+        <w:rPr>
+          <w:vertAlign w:val="superscript"/>
+          <w:rtl/>
+          <w:cs/>
           <w:lang w:val="ar_AE" w:bidi="ar_AE"/>
         </w:rPr>
         <w:t>30</w:t>
       </w:r>
       <w:r>
         <w:rPr>
+          <w:rtl/>
+          <w:cs/>
           <w:lang w:val="ar_AE" w:bidi="ar_AE"/>
         </w:rPr>
         <w:t xml:space="preserve"> وَأُجْرِي آيَاتٍ فِي السَّمَاءِ وَعَلَى الأَرْضِ، دَماً وَنَاراً وَأَعْمِدَةَ دُخَانٍ.</w:t>
       </w:r>
-      <w:r>
-        <w:rPr>
-          <w:lang w:val="ar_AE" w:bidi="ar_AE"/>
-        </w:rPr>
-      </w:r>
-      <w:r>
-        <w:rPr>
-          <w:lang w:val="ar_AE" w:bidi="ar_AE"/>
-        </w:rPr>
-      </w:r>
-    </w:p>
-    <w:p>
-      <w:pPr>
-        <w:bidi/>
-      </w:pPr>
-      <w:r>
-        <w:rPr>
-          <w:lang w:val="ar_AE" w:bidi="ar_AE"/>
-        </w:rPr>
-      </w:r>
-    </w:p>
-    <w:p>
-      <w:pPr>
-        <w:bidi/>
-      </w:pPr>
-      <w:r>
-        <w:rPr>
-          <w:lang w:val="ar_AE" w:bidi="ar_AE"/>
-        </w:rPr>
-      </w:r>
-      <w:r>
-        <w:rPr>
-          <w:vertAlign w:val="superscript"/>
+    </w:p>
+    <w:p>
+      <w:pPr>
+        <w:bidi/>
+      </w:pPr>
+      <w:r>
+        <w:rPr>
+          <w:rtl/>
+          <w:cs/>
+          <w:lang w:val="ar_AE" w:bidi="ar_AE"/>
+        </w:rPr>
+      </w:r>
+      <w:r>
+        <w:rPr>
+          <w:vertAlign w:val="superscript"/>
+          <w:rtl/>
+          <w:cs/>
           <w:lang w:val="ar_AE" w:bidi="ar_AE"/>
         </w:rPr>
         <w:t>31</w:t>
       </w:r>
       <w:r>
         <w:rPr>
+          <w:rtl/>
+          <w:cs/>
           <w:lang w:val="ar_AE" w:bidi="ar_AE"/>
         </w:rPr>
         <w:t xml:space="preserve"> وَتَتَحَوَّلُ الشَّمْسُ إِلَى ظَلامٍ، وَالْقَمَرُ إِلَى دَمٍ، قَبْلَ مَجِيءِ يَوْمِ الرَّبِّ الْعَظِيمِ الْمُخِيفِ.</w:t>
       </w:r>
-      <w:r>
-        <w:rPr>
-          <w:lang w:val="ar_AE" w:bidi="ar_AE"/>
-        </w:rPr>
-      </w:r>
-      <w:r>
-        <w:rPr>
-          <w:lang w:val="ar_AE" w:bidi="ar_AE"/>
-        </w:rPr>
-      </w:r>
-    </w:p>
-    <w:p>
-      <w:pPr>
-        <w:bidi/>
-      </w:pPr>
-      <w:r>
-        <w:rPr>
-          <w:lang w:val="ar_AE" w:bidi="ar_AE"/>
-        </w:rPr>
-      </w:r>
-    </w:p>
-    <w:p>
-      <w:pPr>
-        <w:bidi/>
-      </w:pPr>
-      <w:r>
-        <w:rPr>
-          <w:lang w:val="ar_AE" w:bidi="ar_AE"/>
-        </w:rPr>
-      </w:r>
-      <w:r>
-        <w:rPr>
-          <w:vertAlign w:val="superscript"/>
+    </w:p>
+    <w:p>
+      <w:pPr>
+        <w:bidi/>
+      </w:pPr>
+      <w:r>
+        <w:rPr>
+          <w:rtl/>
+          <w:cs/>
+          <w:lang w:val="ar_AE" w:bidi="ar_AE"/>
+        </w:rPr>
+      </w:r>
+      <w:r>
+        <w:rPr>
+          <w:vertAlign w:val="superscript"/>
+          <w:rtl/>
+          <w:cs/>
           <w:lang w:val="ar_AE" w:bidi="ar_AE"/>
         </w:rPr>
         <w:t>32</w:t>
       </w:r>
       <w:r>
         <w:rPr>
+          <w:rtl/>
+          <w:cs/>
           <w:lang w:val="ar_AE" w:bidi="ar_AE"/>
         </w:rPr>
         <w:t xml:space="preserve"> إِنَّمَا كُلُّ مَنْ يَدْعُو بِاسْمِ الرَّبِّ يَخْلُصُ، لأَنَّ النَّجَاةَ تَكُونُ فِي جَبَلِ صِهْيَوْنَ وَفِي أُورُشَلِيمَ، كَمَا قَالَ الرَّبُّ، إِذْ يَكُونُ بَيْنَ النَّاجِينَ مَنْ يَدْعُوهُ الرَّبُّ.</w:t>
       </w:r>
-      <w:r>
-        <w:rPr>
-          <w:lang w:val="ar_AE" w:bidi="ar_AE"/>
-        </w:rPr>
-      </w:r>
-      <w:r>
-        <w:rPr>
-          <w:lang w:val="ar_AE" w:bidi="ar_AE"/>
-        </w:rPr>
-      </w:r>
-    </w:p>
-    <w:p>
-      <w:pPr>
-        <w:bidi/>
-      </w:pPr>
-      <w:r>
-        <w:rPr>
-          <w:lang w:val="ar_AE" w:bidi="ar_AE"/>
-        </w:rPr>
-      </w:r>
     </w:p>
     <w:p>
       <w:pPr>
@@ -2511,907 +1786,627 @@
       </w:pPr>
       <w:r>
         <w:rPr>
-          <w:lang w:val="ar_AE" w:bidi="ar_AE"/>
-        </w:rPr>
-        <w:t>Joel 3:1</w:t>
-      </w:r>
-      <w:r>
-        <w:rPr>
-          <w:lang w:val="ar_AE" w:bidi="ar_AE"/>
-        </w:rPr>
-      </w:r>
-    </w:p>
-    <w:p>
-      <w:pPr>
-        <w:bidi/>
-      </w:pPr>
-      <w:r>
-        <w:rPr>
-          <w:lang w:val="ar_AE" w:bidi="ar_AE"/>
-        </w:rPr>
-      </w:r>
-      <w:r>
-        <w:rPr>
-          <w:vertAlign w:val="superscript"/>
+          <w:rtl/>
+          <w:cs/>
+          <w:lang w:val="ar_AE" w:bidi="ar_AE"/>
+        </w:rPr>
+        <w:t>يوئيل 3:1</w:t>
+      </w:r>
+      <w:r>
+        <w:rPr>
+          <w:rtl/>
+          <w:cs/>
+          <w:lang w:val="ar_AE" w:bidi="ar_AE"/>
+        </w:rPr>
+      </w:r>
+    </w:p>
+    <w:p>
+      <w:pPr>
+        <w:bidi/>
+      </w:pPr>
+      <w:r>
+        <w:rPr>
+          <w:rtl/>
+          <w:cs/>
+          <w:lang w:val="ar_AE" w:bidi="ar_AE"/>
+        </w:rPr>
+      </w:r>
+      <w:r>
+        <w:rPr>
+          <w:vertAlign w:val="superscript"/>
+          <w:rtl/>
+          <w:cs/>
           <w:lang w:val="ar_AE" w:bidi="ar_AE"/>
         </w:rPr>
         <w:t>1</w:t>
       </w:r>
       <w:r>
         <w:rPr>
+          <w:rtl/>
+          <w:cs/>
           <w:lang w:val="ar_AE" w:bidi="ar_AE"/>
         </w:rPr>
         <w:t xml:space="preserve"> لأَنَّهُ فِي تِلْكَ الأَيَّامِ، وَفِي ذَلِكَ الْحِينِ عِنْدَمَا أَرُدُّ سَبْيَ يَهُوذَا وَأُورُشَلِيمَ،</w:t>
       </w:r>
-      <w:r>
-        <w:rPr>
-          <w:lang w:val="ar_AE" w:bidi="ar_AE"/>
-        </w:rPr>
-      </w:r>
-      <w:r>
-        <w:rPr>
-          <w:lang w:val="ar_AE" w:bidi="ar_AE"/>
-        </w:rPr>
-      </w:r>
-    </w:p>
-    <w:p>
-      <w:pPr>
-        <w:bidi/>
-      </w:pPr>
-      <w:r>
-        <w:rPr>
-          <w:lang w:val="ar_AE" w:bidi="ar_AE"/>
-        </w:rPr>
-      </w:r>
-    </w:p>
-    <w:p>
-      <w:pPr>
-        <w:bidi/>
-      </w:pPr>
-      <w:r>
-        <w:rPr>
-          <w:lang w:val="ar_AE" w:bidi="ar_AE"/>
-        </w:rPr>
-      </w:r>
-      <w:r>
-        <w:rPr>
-          <w:vertAlign w:val="superscript"/>
+    </w:p>
+    <w:p>
+      <w:pPr>
+        <w:bidi/>
+      </w:pPr>
+      <w:r>
+        <w:rPr>
+          <w:rtl/>
+          <w:cs/>
+          <w:lang w:val="ar_AE" w:bidi="ar_AE"/>
+        </w:rPr>
+      </w:r>
+      <w:r>
+        <w:rPr>
+          <w:vertAlign w:val="superscript"/>
+          <w:rtl/>
+          <w:cs/>
           <w:lang w:val="ar_AE" w:bidi="ar_AE"/>
         </w:rPr>
         <w:t>2</w:t>
       </w:r>
       <w:r>
         <w:rPr>
+          <w:rtl/>
+          <w:cs/>
           <w:lang w:val="ar_AE" w:bidi="ar_AE"/>
         </w:rPr>
         <w:t xml:space="preserve"> أَجْمَعُ الأُمَمَ كُلَّهَا وَأُحْضِرُهُمْ إِلَى وَادِي يَهُوشَافَاطَ، وَأُحَاكِمُهُمْ هُنَاكَ مِنْ أَجْلِ شَعْبِي وَمِيرَاثِي إِسْرَائِيلَ، لأَنَّهُمْ شَتَّتُوهُمْ بَيْنَ الشُّعُوبِ وَاقْتَسَمُوا أَرْضِي.</w:t>
       </w:r>
-      <w:r>
-        <w:rPr>
-          <w:lang w:val="ar_AE" w:bidi="ar_AE"/>
-        </w:rPr>
-      </w:r>
-      <w:r>
-        <w:rPr>
-          <w:lang w:val="ar_AE" w:bidi="ar_AE"/>
-        </w:rPr>
-      </w:r>
-    </w:p>
-    <w:p>
-      <w:pPr>
-        <w:bidi/>
-      </w:pPr>
-      <w:r>
-        <w:rPr>
-          <w:lang w:val="ar_AE" w:bidi="ar_AE"/>
-        </w:rPr>
-      </w:r>
-    </w:p>
-    <w:p>
-      <w:pPr>
-        <w:bidi/>
-      </w:pPr>
-      <w:r>
-        <w:rPr>
-          <w:lang w:val="ar_AE" w:bidi="ar_AE"/>
-        </w:rPr>
-      </w:r>
-      <w:r>
-        <w:rPr>
-          <w:vertAlign w:val="superscript"/>
+    </w:p>
+    <w:p>
+      <w:pPr>
+        <w:bidi/>
+      </w:pPr>
+      <w:r>
+        <w:rPr>
+          <w:rtl/>
+          <w:cs/>
+          <w:lang w:val="ar_AE" w:bidi="ar_AE"/>
+        </w:rPr>
+      </w:r>
+      <w:r>
+        <w:rPr>
+          <w:vertAlign w:val="superscript"/>
+          <w:rtl/>
+          <w:cs/>
           <w:lang w:val="ar_AE" w:bidi="ar_AE"/>
         </w:rPr>
         <w:t>3</w:t>
       </w:r>
       <w:r>
         <w:rPr>
+          <w:rtl/>
+          <w:cs/>
           <w:lang w:val="ar_AE" w:bidi="ar_AE"/>
         </w:rPr>
         <w:t xml:space="preserve"> وَأَلْقَوْا الْقُرْعَةَ عَلَى شَعْبِي فَقَايَضُوا الزَّانِيَةَ بِالصَّبِيِّ، وَبَاعُوا الصَّبِيَّةَ لِقَاءَ شُرْبَةِ خَمْرٍ.</w:t>
       </w:r>
-      <w:r>
-        <w:rPr>
-          <w:lang w:val="ar_AE" w:bidi="ar_AE"/>
-        </w:rPr>
-      </w:r>
-      <w:r>
-        <w:rPr>
-          <w:lang w:val="ar_AE" w:bidi="ar_AE"/>
-        </w:rPr>
-      </w:r>
-    </w:p>
-    <w:p>
-      <w:pPr>
-        <w:bidi/>
-      </w:pPr>
-      <w:r>
-        <w:rPr>
-          <w:lang w:val="ar_AE" w:bidi="ar_AE"/>
-        </w:rPr>
-      </w:r>
-    </w:p>
-    <w:p>
-      <w:pPr>
-        <w:bidi/>
-      </w:pPr>
-      <w:r>
-        <w:rPr>
-          <w:lang w:val="ar_AE" w:bidi="ar_AE"/>
-        </w:rPr>
-      </w:r>
-      <w:r>
-        <w:rPr>
-          <w:vertAlign w:val="superscript"/>
+    </w:p>
+    <w:p>
+      <w:pPr>
+        <w:bidi/>
+      </w:pPr>
+      <w:r>
+        <w:rPr>
+          <w:rtl/>
+          <w:cs/>
+          <w:lang w:val="ar_AE" w:bidi="ar_AE"/>
+        </w:rPr>
+      </w:r>
+      <w:r>
+        <w:rPr>
+          <w:vertAlign w:val="superscript"/>
+          <w:rtl/>
+          <w:cs/>
           <w:lang w:val="ar_AE" w:bidi="ar_AE"/>
         </w:rPr>
         <w:t>4</w:t>
       </w:r>
       <w:r>
         <w:rPr>
+          <w:rtl/>
+          <w:cs/>
           <w:lang w:val="ar_AE" w:bidi="ar_AE"/>
         </w:rPr>
         <w:t xml:space="preserve"> مَاذَا لَدَيْكُمْ ضِدِّي يَا صُورُ وَصِيْدُونُ وَسَائِرَ أَقَالِيمِ فِلِسْطِينَ؟ أَتُجَازُونَنِي عَلَى أَمْرٍ أَتَيْتُهُ؟ أَمْ تَسْعَوْنَ لإِيذَائِي؟ إِنِّي أُنْزِلُ الْعِقَابَ عَلَى رُؤُوسِكُمْ بَغْتَةً وَسَرِيعاً.</w:t>
       </w:r>
-      <w:r>
-        <w:rPr>
-          <w:lang w:val="ar_AE" w:bidi="ar_AE"/>
-        </w:rPr>
-      </w:r>
-      <w:r>
-        <w:rPr>
-          <w:lang w:val="ar_AE" w:bidi="ar_AE"/>
-        </w:rPr>
-      </w:r>
-    </w:p>
-    <w:p>
-      <w:pPr>
-        <w:bidi/>
-      </w:pPr>
-      <w:r>
-        <w:rPr>
-          <w:lang w:val="ar_AE" w:bidi="ar_AE"/>
-        </w:rPr>
-      </w:r>
-    </w:p>
-    <w:p>
-      <w:pPr>
-        <w:bidi/>
-      </w:pPr>
-      <w:r>
-        <w:rPr>
-          <w:lang w:val="ar_AE" w:bidi="ar_AE"/>
-        </w:rPr>
-      </w:r>
-      <w:r>
-        <w:rPr>
-          <w:vertAlign w:val="superscript"/>
+    </w:p>
+    <w:p>
+      <w:pPr>
+        <w:bidi/>
+      </w:pPr>
+      <w:r>
+        <w:rPr>
+          <w:rtl/>
+          <w:cs/>
+          <w:lang w:val="ar_AE" w:bidi="ar_AE"/>
+        </w:rPr>
+      </w:r>
+      <w:r>
+        <w:rPr>
+          <w:vertAlign w:val="superscript"/>
+          <w:rtl/>
+          <w:cs/>
           <w:lang w:val="ar_AE" w:bidi="ar_AE"/>
         </w:rPr>
         <w:t>5</w:t>
       </w:r>
       <w:r>
         <w:rPr>
+          <w:rtl/>
+          <w:cs/>
           <w:lang w:val="ar_AE" w:bidi="ar_AE"/>
         </w:rPr>
         <w:t xml:space="preserve"> لأَنَّكُمْ قَدِ اسْتَوْلَيْتُمْ عَلَى ذَهَبِي وَفِضَّتِي، وَنَقَلْتُمْ نَفَائِسِي إِلَى هَيَاكِلِكُمْ.</w:t>
       </w:r>
-      <w:r>
-        <w:rPr>
-          <w:lang w:val="ar_AE" w:bidi="ar_AE"/>
-        </w:rPr>
-      </w:r>
-      <w:r>
-        <w:rPr>
-          <w:lang w:val="ar_AE" w:bidi="ar_AE"/>
-        </w:rPr>
-      </w:r>
-    </w:p>
-    <w:p>
-      <w:pPr>
-        <w:bidi/>
-      </w:pPr>
-      <w:r>
-        <w:rPr>
-          <w:lang w:val="ar_AE" w:bidi="ar_AE"/>
-        </w:rPr>
-      </w:r>
-    </w:p>
-    <w:p>
-      <w:pPr>
-        <w:bidi/>
-      </w:pPr>
-      <w:r>
-        <w:rPr>
-          <w:lang w:val="ar_AE" w:bidi="ar_AE"/>
-        </w:rPr>
-      </w:r>
-      <w:r>
-        <w:rPr>
-          <w:vertAlign w:val="superscript"/>
+    </w:p>
+    <w:p>
+      <w:pPr>
+        <w:bidi/>
+      </w:pPr>
+      <w:r>
+        <w:rPr>
+          <w:rtl/>
+          <w:cs/>
+          <w:lang w:val="ar_AE" w:bidi="ar_AE"/>
+        </w:rPr>
+      </w:r>
+      <w:r>
+        <w:rPr>
+          <w:vertAlign w:val="superscript"/>
+          <w:rtl/>
+          <w:cs/>
           <w:lang w:val="ar_AE" w:bidi="ar_AE"/>
         </w:rPr>
         <w:t>6</w:t>
       </w:r>
       <w:r>
         <w:rPr>
+          <w:rtl/>
+          <w:cs/>
           <w:lang w:val="ar_AE" w:bidi="ar_AE"/>
         </w:rPr>
         <w:t xml:space="preserve"> وَبِعْتُمْ يَهُوذَا وَأَبْنَاءَ أُورُشَلِيمَ إِلَى الْيُونَانِيِّينَ لِتُبْعِدُوهُمْ عَنْ تُخُومِ أَرْضِهِمْ.</w:t>
       </w:r>
-      <w:r>
-        <w:rPr>
-          <w:lang w:val="ar_AE" w:bidi="ar_AE"/>
-        </w:rPr>
-      </w:r>
-      <w:r>
-        <w:rPr>
-          <w:lang w:val="ar_AE" w:bidi="ar_AE"/>
-        </w:rPr>
-      </w:r>
-    </w:p>
-    <w:p>
-      <w:pPr>
-        <w:bidi/>
-      </w:pPr>
-      <w:r>
-        <w:rPr>
-          <w:lang w:val="ar_AE" w:bidi="ar_AE"/>
-        </w:rPr>
-      </w:r>
-    </w:p>
-    <w:p>
-      <w:pPr>
-        <w:bidi/>
-      </w:pPr>
-      <w:r>
-        <w:rPr>
-          <w:lang w:val="ar_AE" w:bidi="ar_AE"/>
-        </w:rPr>
-      </w:r>
-      <w:r>
-        <w:rPr>
-          <w:vertAlign w:val="superscript"/>
+    </w:p>
+    <w:p>
+      <w:pPr>
+        <w:bidi/>
+      </w:pPr>
+      <w:r>
+        <w:rPr>
+          <w:rtl/>
+          <w:cs/>
+          <w:lang w:val="ar_AE" w:bidi="ar_AE"/>
+        </w:rPr>
+      </w:r>
+      <w:r>
+        <w:rPr>
+          <w:vertAlign w:val="superscript"/>
+          <w:rtl/>
+          <w:cs/>
           <w:lang w:val="ar_AE" w:bidi="ar_AE"/>
         </w:rPr>
         <w:t>7</w:t>
       </w:r>
       <w:r>
         <w:rPr>
+          <w:rtl/>
+          <w:cs/>
           <w:lang w:val="ar_AE" w:bidi="ar_AE"/>
         </w:rPr>
         <w:t xml:space="preserve"> وَهَا أَنَا الآنَ أُنْهِضُهُمْ مِنَ الْمَوْضِعِ حَيْثُ بِعْتُمُوهُمْ، وَأَرُدُّ عَلَى رُؤُوسِكُمْ سُوءَ أَعْمَالِكُمْ.</w:t>
       </w:r>
-      <w:r>
-        <w:rPr>
-          <w:lang w:val="ar_AE" w:bidi="ar_AE"/>
-        </w:rPr>
-      </w:r>
-      <w:r>
-        <w:rPr>
-          <w:lang w:val="ar_AE" w:bidi="ar_AE"/>
-        </w:rPr>
-      </w:r>
-    </w:p>
-    <w:p>
-      <w:pPr>
-        <w:bidi/>
-      </w:pPr>
-      <w:r>
-        <w:rPr>
-          <w:lang w:val="ar_AE" w:bidi="ar_AE"/>
-        </w:rPr>
-      </w:r>
-    </w:p>
-    <w:p>
-      <w:pPr>
-        <w:bidi/>
-      </w:pPr>
-      <w:r>
-        <w:rPr>
-          <w:lang w:val="ar_AE" w:bidi="ar_AE"/>
-        </w:rPr>
-      </w:r>
-      <w:r>
-        <w:rPr>
-          <w:vertAlign w:val="superscript"/>
+    </w:p>
+    <w:p>
+      <w:pPr>
+        <w:bidi/>
+      </w:pPr>
+      <w:r>
+        <w:rPr>
+          <w:rtl/>
+          <w:cs/>
+          <w:lang w:val="ar_AE" w:bidi="ar_AE"/>
+        </w:rPr>
+      </w:r>
+      <w:r>
+        <w:rPr>
+          <w:vertAlign w:val="superscript"/>
+          <w:rtl/>
+          <w:cs/>
           <w:lang w:val="ar_AE" w:bidi="ar_AE"/>
         </w:rPr>
         <w:t>8</w:t>
       </w:r>
       <w:r>
         <w:rPr>
+          <w:rtl/>
+          <w:cs/>
           <w:lang w:val="ar_AE" w:bidi="ar_AE"/>
         </w:rPr>
         <w:t xml:space="preserve"> وَأَبِيعُ أَبْنَاءَكُمْ وَبَنَاتِكُمْ بِأَيْدِي أَبْنَاءِ يَهُوذَا، فَيَبِيعُونَهُمْ بِدَوْرِهِمْ إِلَى السَّبَئِيِّينَ، إِلَى أُمَّةٍ بَعِيدَةٍ، لأَنَّ الرَّبَّ قَدْ أَصْدَرَ قَضَاءَهُ.</w:t>
       </w:r>
-      <w:r>
-        <w:rPr>
-          <w:lang w:val="ar_AE" w:bidi="ar_AE"/>
-        </w:rPr>
-      </w:r>
-      <w:r>
-        <w:rPr>
-          <w:lang w:val="ar_AE" w:bidi="ar_AE"/>
-        </w:rPr>
-      </w:r>
-    </w:p>
-    <w:p>
-      <w:pPr>
-        <w:bidi/>
-      </w:pPr>
-      <w:r>
-        <w:rPr>
-          <w:lang w:val="ar_AE" w:bidi="ar_AE"/>
-        </w:rPr>
-      </w:r>
-    </w:p>
-    <w:p>
-      <w:pPr>
-        <w:bidi/>
-      </w:pPr>
-      <w:r>
-        <w:rPr>
-          <w:lang w:val="ar_AE" w:bidi="ar_AE"/>
-        </w:rPr>
-      </w:r>
-      <w:r>
-        <w:rPr>
-          <w:vertAlign w:val="superscript"/>
+    </w:p>
+    <w:p>
+      <w:pPr>
+        <w:bidi/>
+      </w:pPr>
+      <w:r>
+        <w:rPr>
+          <w:rtl/>
+          <w:cs/>
+          <w:lang w:val="ar_AE" w:bidi="ar_AE"/>
+        </w:rPr>
+      </w:r>
+      <w:r>
+        <w:rPr>
+          <w:vertAlign w:val="superscript"/>
+          <w:rtl/>
+          <w:cs/>
           <w:lang w:val="ar_AE" w:bidi="ar_AE"/>
         </w:rPr>
         <w:t>9</w:t>
       </w:r>
       <w:r>
         <w:rPr>
+          <w:rtl/>
+          <w:cs/>
           <w:lang w:val="ar_AE" w:bidi="ar_AE"/>
         </w:rPr>
         <w:t xml:space="preserve"> نَادُوا بِهَذَا بَيْنَ الأُمَمِ، وَتَأَهَّبُوا لِلْحَرْبِ. اُحْشُدُوا أَبْطَالَكُمْ. لِيَتَقَدَّمْ وَيَصْعَدْ جَمِيعُ رِجَالِ الْقِتَالِ.</w:t>
       </w:r>
-      <w:r>
-        <w:rPr>
-          <w:lang w:val="ar_AE" w:bidi="ar_AE"/>
-        </w:rPr>
-      </w:r>
-      <w:r>
-        <w:rPr>
-          <w:lang w:val="ar_AE" w:bidi="ar_AE"/>
-        </w:rPr>
-      </w:r>
-    </w:p>
-    <w:p>
-      <w:pPr>
-        <w:bidi/>
-      </w:pPr>
-      <w:r>
-        <w:rPr>
-          <w:lang w:val="ar_AE" w:bidi="ar_AE"/>
-        </w:rPr>
-      </w:r>
-    </w:p>
-    <w:p>
-      <w:pPr>
-        <w:bidi/>
-      </w:pPr>
-      <w:r>
-        <w:rPr>
-          <w:lang w:val="ar_AE" w:bidi="ar_AE"/>
-        </w:rPr>
-      </w:r>
-      <w:r>
-        <w:rPr>
-          <w:vertAlign w:val="superscript"/>
+    </w:p>
+    <w:p>
+      <w:pPr>
+        <w:bidi/>
+      </w:pPr>
+      <w:r>
+        <w:rPr>
+          <w:rtl/>
+          <w:cs/>
+          <w:lang w:val="ar_AE" w:bidi="ar_AE"/>
+        </w:rPr>
+      </w:r>
+      <w:r>
+        <w:rPr>
+          <w:vertAlign w:val="superscript"/>
+          <w:rtl/>
+          <w:cs/>
           <w:lang w:val="ar_AE" w:bidi="ar_AE"/>
         </w:rPr>
         <w:t>10</w:t>
       </w:r>
       <w:r>
         <w:rPr>
+          <w:rtl/>
+          <w:cs/>
           <w:lang w:val="ar_AE" w:bidi="ar_AE"/>
         </w:rPr>
         <w:t xml:space="preserve"> أَطْرِقُوا أَسْنَانَ مَحَارِيثِكُمْ وَحَوِّلُوهَا إِلَى سُيُوفٍ، وَمَنَاجِلَكُمْ إِلَى رِمَاحٍ، وَلْيَقُلِ الضَّعِيفُ: إِنَّنِي جَبَّارُ قِتَالٍ!</w:t>
       </w:r>
-      <w:r>
-        <w:rPr>
-          <w:lang w:val="ar_AE" w:bidi="ar_AE"/>
-        </w:rPr>
-      </w:r>
-      <w:r>
-        <w:rPr>
-          <w:lang w:val="ar_AE" w:bidi="ar_AE"/>
-        </w:rPr>
-      </w:r>
-    </w:p>
-    <w:p>
-      <w:pPr>
-        <w:bidi/>
-      </w:pPr>
-      <w:r>
-        <w:rPr>
-          <w:lang w:val="ar_AE" w:bidi="ar_AE"/>
-        </w:rPr>
-      </w:r>
-    </w:p>
-    <w:p>
-      <w:pPr>
-        <w:bidi/>
-      </w:pPr>
-      <w:r>
-        <w:rPr>
-          <w:lang w:val="ar_AE" w:bidi="ar_AE"/>
-        </w:rPr>
-      </w:r>
-      <w:r>
-        <w:rPr>
-          <w:vertAlign w:val="superscript"/>
+    </w:p>
+    <w:p>
+      <w:pPr>
+        <w:bidi/>
+      </w:pPr>
+      <w:r>
+        <w:rPr>
+          <w:rtl/>
+          <w:cs/>
+          <w:lang w:val="ar_AE" w:bidi="ar_AE"/>
+        </w:rPr>
+      </w:r>
+      <w:r>
+        <w:rPr>
+          <w:vertAlign w:val="superscript"/>
+          <w:rtl/>
+          <w:cs/>
           <w:lang w:val="ar_AE" w:bidi="ar_AE"/>
         </w:rPr>
         <w:t>11</w:t>
       </w:r>
       <w:r>
         <w:rPr>
+          <w:rtl/>
+          <w:cs/>
           <w:lang w:val="ar_AE" w:bidi="ar_AE"/>
         </w:rPr>
         <w:t xml:space="preserve"> أَسْرِعُوا وَتَعَالَوْا مِنْ كُلِّ نَاحِيَةٍ يَا كُلَّ الأُمَمِ، وَاجْتَمِعُوا هُنَاكَ، وَأَنْزِلْ يَا رَبُّ مُحَارِبِيكَ.</w:t>
       </w:r>
-      <w:r>
-        <w:rPr>
-          <w:lang w:val="ar_AE" w:bidi="ar_AE"/>
-        </w:rPr>
-      </w:r>
-      <w:r>
-        <w:rPr>
-          <w:lang w:val="ar_AE" w:bidi="ar_AE"/>
-        </w:rPr>
-      </w:r>
-    </w:p>
-    <w:p>
-      <w:pPr>
-        <w:bidi/>
-      </w:pPr>
-      <w:r>
-        <w:rPr>
-          <w:lang w:val="ar_AE" w:bidi="ar_AE"/>
-        </w:rPr>
-      </w:r>
-    </w:p>
-    <w:p>
-      <w:pPr>
-        <w:bidi/>
-      </w:pPr>
-      <w:r>
-        <w:rPr>
-          <w:lang w:val="ar_AE" w:bidi="ar_AE"/>
-        </w:rPr>
-      </w:r>
-      <w:r>
-        <w:rPr>
-          <w:vertAlign w:val="superscript"/>
+    </w:p>
+    <w:p>
+      <w:pPr>
+        <w:bidi/>
+      </w:pPr>
+      <w:r>
+        <w:rPr>
+          <w:rtl/>
+          <w:cs/>
+          <w:lang w:val="ar_AE" w:bidi="ar_AE"/>
+        </w:rPr>
+      </w:r>
+      <w:r>
+        <w:rPr>
+          <w:vertAlign w:val="superscript"/>
+          <w:rtl/>
+          <w:cs/>
           <w:lang w:val="ar_AE" w:bidi="ar_AE"/>
         </w:rPr>
         <w:t>12</w:t>
       </w:r>
       <w:r>
         <w:rPr>
+          <w:rtl/>
+          <w:cs/>
           <w:lang w:val="ar_AE" w:bidi="ar_AE"/>
         </w:rPr>
         <w:t xml:space="preserve"> لِتَنْهَضِ الأُمَمُ وَتُقْبِلْ إِلَى وَادِي الْقَضَاءِ لأَنَّنِي هُنَاكَ أَجْلِسُ لأُدِينَ الشُّعُوبَ الْمُتَوَافِدَةَ مِنْ كُلِّ جِهَةٍ.</w:t>
       </w:r>
-      <w:r>
-        <w:rPr>
-          <w:lang w:val="ar_AE" w:bidi="ar_AE"/>
-        </w:rPr>
-      </w:r>
-      <w:r>
-        <w:rPr>
-          <w:lang w:val="ar_AE" w:bidi="ar_AE"/>
-        </w:rPr>
-      </w:r>
-    </w:p>
-    <w:p>
-      <w:pPr>
-        <w:bidi/>
-      </w:pPr>
-      <w:r>
-        <w:rPr>
-          <w:lang w:val="ar_AE" w:bidi="ar_AE"/>
-        </w:rPr>
-      </w:r>
-    </w:p>
-    <w:p>
-      <w:pPr>
-        <w:bidi/>
-      </w:pPr>
-      <w:r>
-        <w:rPr>
-          <w:lang w:val="ar_AE" w:bidi="ar_AE"/>
-        </w:rPr>
-      </w:r>
-      <w:r>
-        <w:rPr>
-          <w:vertAlign w:val="superscript"/>
+    </w:p>
+    <w:p>
+      <w:pPr>
+        <w:bidi/>
+      </w:pPr>
+      <w:r>
+        <w:rPr>
+          <w:rtl/>
+          <w:cs/>
+          <w:lang w:val="ar_AE" w:bidi="ar_AE"/>
+        </w:rPr>
+      </w:r>
+      <w:r>
+        <w:rPr>
+          <w:vertAlign w:val="superscript"/>
+          <w:rtl/>
+          <w:cs/>
           <w:lang w:val="ar_AE" w:bidi="ar_AE"/>
         </w:rPr>
         <w:t>13</w:t>
       </w:r>
       <w:r>
         <w:rPr>
+          <w:rtl/>
+          <w:cs/>
           <w:lang w:val="ar_AE" w:bidi="ar_AE"/>
         </w:rPr>
         <w:t xml:space="preserve"> احْمِلُوا الْمِنْجَلَ لأَنَّ الْحَصِيدَ قَدْ نَضَجَ. تَعَالَوْا وَدُوسُوا فَإِنَّ مِعْصَرَةَ الْخَمْرِ قَدِ امْتَلأَتْ، وَالْحِيَاضَ فَاضَتْ بِكَثْرَةِ شَرِّهِمْ.</w:t>
       </w:r>
-      <w:r>
-        <w:rPr>
-          <w:lang w:val="ar_AE" w:bidi="ar_AE"/>
-        </w:rPr>
-      </w:r>
-      <w:r>
-        <w:rPr>
-          <w:lang w:val="ar_AE" w:bidi="ar_AE"/>
-        </w:rPr>
-      </w:r>
-    </w:p>
-    <w:p>
-      <w:pPr>
-        <w:bidi/>
-      </w:pPr>
-      <w:r>
-        <w:rPr>
-          <w:lang w:val="ar_AE" w:bidi="ar_AE"/>
-        </w:rPr>
-      </w:r>
-    </w:p>
-    <w:p>
-      <w:pPr>
-        <w:bidi/>
-      </w:pPr>
-      <w:r>
-        <w:rPr>
-          <w:lang w:val="ar_AE" w:bidi="ar_AE"/>
-        </w:rPr>
-      </w:r>
-      <w:r>
-        <w:rPr>
-          <w:vertAlign w:val="superscript"/>
+    </w:p>
+    <w:p>
+      <w:pPr>
+        <w:bidi/>
+      </w:pPr>
+      <w:r>
+        <w:rPr>
+          <w:rtl/>
+          <w:cs/>
+          <w:lang w:val="ar_AE" w:bidi="ar_AE"/>
+        </w:rPr>
+      </w:r>
+      <w:r>
+        <w:rPr>
+          <w:vertAlign w:val="superscript"/>
+          <w:rtl/>
+          <w:cs/>
           <w:lang w:val="ar_AE" w:bidi="ar_AE"/>
         </w:rPr>
         <w:t>14</w:t>
       </w:r>
       <w:r>
         <w:rPr>
+          <w:rtl/>
+          <w:cs/>
           <w:lang w:val="ar_AE" w:bidi="ar_AE"/>
         </w:rPr>
         <w:t xml:space="preserve"> جَمَاهِيرُ جَمَاهِيرُ مُتَزَاحِمَةٌ فِي وَادِي الْقَضَاءِ، لأَنَّ يَوْمَ الرَّبِّ قَرِيبٌ فِي وَادِي الْقَضَاءِ.</w:t>
       </w:r>
-      <w:r>
-        <w:rPr>
-          <w:lang w:val="ar_AE" w:bidi="ar_AE"/>
-        </w:rPr>
-      </w:r>
-      <w:r>
-        <w:rPr>
-          <w:lang w:val="ar_AE" w:bidi="ar_AE"/>
-        </w:rPr>
-      </w:r>
-    </w:p>
-    <w:p>
-      <w:pPr>
-        <w:bidi/>
-      </w:pPr>
-      <w:r>
-        <w:rPr>
-          <w:lang w:val="ar_AE" w:bidi="ar_AE"/>
-        </w:rPr>
-      </w:r>
-    </w:p>
-    <w:p>
-      <w:pPr>
-        <w:bidi/>
-      </w:pPr>
-      <w:r>
-        <w:rPr>
-          <w:lang w:val="ar_AE" w:bidi="ar_AE"/>
-        </w:rPr>
-      </w:r>
-      <w:r>
-        <w:rPr>
-          <w:vertAlign w:val="superscript"/>
+    </w:p>
+    <w:p>
+      <w:pPr>
+        <w:bidi/>
+      </w:pPr>
+      <w:r>
+        <w:rPr>
+          <w:rtl/>
+          <w:cs/>
+          <w:lang w:val="ar_AE" w:bidi="ar_AE"/>
+        </w:rPr>
+      </w:r>
+      <w:r>
+        <w:rPr>
+          <w:vertAlign w:val="superscript"/>
+          <w:rtl/>
+          <w:cs/>
           <w:lang w:val="ar_AE" w:bidi="ar_AE"/>
         </w:rPr>
         <w:t>15</w:t>
       </w:r>
       <w:r>
         <w:rPr>
+          <w:rtl/>
+          <w:cs/>
           <w:lang w:val="ar_AE" w:bidi="ar_AE"/>
         </w:rPr>
         <w:t xml:space="preserve"> قَدْ أَظْلَمَتِ الشَّمْسُ وَالْقَمَرُ، وَكَفَّتِ الْكَوَاكِبُ عَنِ الضِّيَاءِ.</w:t>
       </w:r>
-      <w:r>
-        <w:rPr>
-          <w:lang w:val="ar_AE" w:bidi="ar_AE"/>
-        </w:rPr>
-      </w:r>
-      <w:r>
-        <w:rPr>
-          <w:lang w:val="ar_AE" w:bidi="ar_AE"/>
-        </w:rPr>
-      </w:r>
-    </w:p>
-    <w:p>
-      <w:pPr>
-        <w:bidi/>
-      </w:pPr>
-      <w:r>
-        <w:rPr>
-          <w:lang w:val="ar_AE" w:bidi="ar_AE"/>
-        </w:rPr>
-      </w:r>
-    </w:p>
-    <w:p>
-      <w:pPr>
-        <w:bidi/>
-      </w:pPr>
-      <w:r>
-        <w:rPr>
-          <w:lang w:val="ar_AE" w:bidi="ar_AE"/>
-        </w:rPr>
-      </w:r>
-      <w:r>
-        <w:rPr>
-          <w:vertAlign w:val="superscript"/>
+    </w:p>
+    <w:p>
+      <w:pPr>
+        <w:bidi/>
+      </w:pPr>
+      <w:r>
+        <w:rPr>
+          <w:rtl/>
+          <w:cs/>
+          <w:lang w:val="ar_AE" w:bidi="ar_AE"/>
+        </w:rPr>
+      </w:r>
+      <w:r>
+        <w:rPr>
+          <w:vertAlign w:val="superscript"/>
+          <w:rtl/>
+          <w:cs/>
           <w:lang w:val="ar_AE" w:bidi="ar_AE"/>
         </w:rPr>
         <w:t>16</w:t>
       </w:r>
       <w:r>
         <w:rPr>
+          <w:rtl/>
+          <w:cs/>
           <w:lang w:val="ar_AE" w:bidi="ar_AE"/>
         </w:rPr>
         <w:t xml:space="preserve"> يَزْأَرُ الرَّبُّ فِي صِهْيَوْنَ، وَيُجَلْجِلُ بِصَوْتِهِ مِنْ أُورُشَلِيمَ فَتَرْجُفُ السَّمَاوَاتُ وَالأَرْضُ؛ لَكِنَّ الرَّبَّ يَكُونُ مَلْجَأً لِشَعْبِهِ، وَحِصْناً لِبَنِي إِسْرَائِيلَ.</w:t>
       </w:r>
-      <w:r>
-        <w:rPr>
-          <w:lang w:val="ar_AE" w:bidi="ar_AE"/>
-        </w:rPr>
-      </w:r>
-      <w:r>
-        <w:rPr>
-          <w:lang w:val="ar_AE" w:bidi="ar_AE"/>
-        </w:rPr>
-      </w:r>
-    </w:p>
-    <w:p>
-      <w:pPr>
-        <w:bidi/>
-      </w:pPr>
-      <w:r>
-        <w:rPr>
-          <w:lang w:val="ar_AE" w:bidi="ar_AE"/>
-        </w:rPr>
-      </w:r>
-    </w:p>
-    <w:p>
-      <w:pPr>
-        <w:bidi/>
-      </w:pPr>
-      <w:r>
-        <w:rPr>
-          <w:lang w:val="ar_AE" w:bidi="ar_AE"/>
-        </w:rPr>
-      </w:r>
-      <w:r>
-        <w:rPr>
-          <w:vertAlign w:val="superscript"/>
+    </w:p>
+    <w:p>
+      <w:pPr>
+        <w:bidi/>
+      </w:pPr>
+      <w:r>
+        <w:rPr>
+          <w:rtl/>
+          <w:cs/>
+          <w:lang w:val="ar_AE" w:bidi="ar_AE"/>
+        </w:rPr>
+      </w:r>
+      <w:r>
+        <w:rPr>
+          <w:vertAlign w:val="superscript"/>
+          <w:rtl/>
+          <w:cs/>
           <w:lang w:val="ar_AE" w:bidi="ar_AE"/>
         </w:rPr>
         <w:t>17</w:t>
       </w:r>
       <w:r>
         <w:rPr>
+          <w:rtl/>
+          <w:cs/>
           <w:lang w:val="ar_AE" w:bidi="ar_AE"/>
         </w:rPr>
         <w:t xml:space="preserve"> فَتُدْرِكُونَ أَنِّي أَنَا هُوَ الرَّبُّ إِلَهُكُمُ السَّاكِنُ فِي صِهْيَوْنَ جَبَلِي الْمُقَدَّسِ، وَتَكُونُ أُورُشَلِيمُ مُقَدَّسَةً وَلا يَجْتَازُ فِيهَا الْغُرَبَاءُ أَبَداً.</w:t>
       </w:r>
-      <w:r>
-        <w:rPr>
-          <w:lang w:val="ar_AE" w:bidi="ar_AE"/>
-        </w:rPr>
-      </w:r>
-      <w:r>
-        <w:rPr>
-          <w:lang w:val="ar_AE" w:bidi="ar_AE"/>
-        </w:rPr>
-      </w:r>
-    </w:p>
-    <w:p>
-      <w:pPr>
-        <w:bidi/>
-      </w:pPr>
-      <w:r>
-        <w:rPr>
-          <w:lang w:val="ar_AE" w:bidi="ar_AE"/>
-        </w:rPr>
-      </w:r>
-    </w:p>
-    <w:p>
-      <w:pPr>
-        <w:bidi/>
-      </w:pPr>
-      <w:r>
-        <w:rPr>
-          <w:lang w:val="ar_AE" w:bidi="ar_AE"/>
-        </w:rPr>
-      </w:r>
-      <w:r>
-        <w:rPr>
-          <w:vertAlign w:val="superscript"/>
+    </w:p>
+    <w:p>
+      <w:pPr>
+        <w:bidi/>
+      </w:pPr>
+      <w:r>
+        <w:rPr>
+          <w:rtl/>
+          <w:cs/>
+          <w:lang w:val="ar_AE" w:bidi="ar_AE"/>
+        </w:rPr>
+      </w:r>
+      <w:r>
+        <w:rPr>
+          <w:vertAlign w:val="superscript"/>
+          <w:rtl/>
+          <w:cs/>
           <w:lang w:val="ar_AE" w:bidi="ar_AE"/>
         </w:rPr>
         <w:t>18</w:t>
       </w:r>
       <w:r>
         <w:rPr>
+          <w:rtl/>
+          <w:cs/>
           <w:lang w:val="ar_AE" w:bidi="ar_AE"/>
         </w:rPr>
         <w:t xml:space="preserve"> وَتَقْطُرُ الْجِبَالُ فِي ذَلِكَ الْيَوْمِ خَمْرَةً عَذْبَةً، وَتَفِيضُ التِّلالُ بِاللَّبَنِ وَجَمِيعُ يَنَابِيعِ يَهُوذَا تَتَدَفَّقُ مَاءً، وَيَخْرُجُ يَنْبُوعٌ مِنْ هَيْكَلِ الرَّبِّ يَرْوِي وَادِي السَّنْطِ،</w:t>
       </w:r>
-      <w:r>
-        <w:rPr>
-          <w:lang w:val="ar_AE" w:bidi="ar_AE"/>
-        </w:rPr>
-      </w:r>
-      <w:r>
-        <w:rPr>
-          <w:lang w:val="ar_AE" w:bidi="ar_AE"/>
-        </w:rPr>
-      </w:r>
-    </w:p>
-    <w:p>
-      <w:pPr>
-        <w:bidi/>
-      </w:pPr>
-      <w:r>
-        <w:rPr>
-          <w:lang w:val="ar_AE" w:bidi="ar_AE"/>
-        </w:rPr>
-      </w:r>
-    </w:p>
-    <w:p>
-      <w:pPr>
-        <w:bidi/>
-      </w:pPr>
-      <w:r>
-        <w:rPr>
-          <w:lang w:val="ar_AE" w:bidi="ar_AE"/>
-        </w:rPr>
-      </w:r>
-      <w:r>
-        <w:rPr>
-          <w:vertAlign w:val="superscript"/>
+    </w:p>
+    <w:p>
+      <w:pPr>
+        <w:bidi/>
+      </w:pPr>
+      <w:r>
+        <w:rPr>
+          <w:rtl/>
+          <w:cs/>
+          <w:lang w:val="ar_AE" w:bidi="ar_AE"/>
+        </w:rPr>
+      </w:r>
+      <w:r>
+        <w:rPr>
+          <w:vertAlign w:val="superscript"/>
+          <w:rtl/>
+          <w:cs/>
           <w:lang w:val="ar_AE" w:bidi="ar_AE"/>
         </w:rPr>
         <w:t>19</w:t>
       </w:r>
       <w:r>
         <w:rPr>
+          <w:rtl/>
+          <w:cs/>
           <w:lang w:val="ar_AE" w:bidi="ar_AE"/>
         </w:rPr>
         <w:t xml:space="preserve"> وَتُصْبِحُ مِصْرُ خَرَاباً، وَأَدُومُ قَفْراً مُوْحِشاً لِفَرْطِ مَا أَنْزَلُوهُ مِنْ ظُلْمٍ بِأَبْنَاءِ يَهُوذَا، وَلأَنَّهُمْ سَفَكُوا دَماً بَرِيئاً فِي دِيَارِهِمْ.</w:t>
       </w:r>
-      <w:r>
-        <w:rPr>
-          <w:lang w:val="ar_AE" w:bidi="ar_AE"/>
-        </w:rPr>
-      </w:r>
-      <w:r>
-        <w:rPr>
-          <w:lang w:val="ar_AE" w:bidi="ar_AE"/>
-        </w:rPr>
-      </w:r>
-    </w:p>
-    <w:p>
-      <w:pPr>
-        <w:bidi/>
-      </w:pPr>
-      <w:r>
-        <w:rPr>
-          <w:lang w:val="ar_AE" w:bidi="ar_AE"/>
-        </w:rPr>
-      </w:r>
-    </w:p>
-    <w:p>
-      <w:pPr>
-        <w:bidi/>
-      </w:pPr>
-      <w:r>
-        <w:rPr>
-          <w:lang w:val="ar_AE" w:bidi="ar_AE"/>
-        </w:rPr>
-      </w:r>
-      <w:r>
-        <w:rPr>
-          <w:vertAlign w:val="superscript"/>
+    </w:p>
+    <w:p>
+      <w:pPr>
+        <w:bidi/>
+      </w:pPr>
+      <w:r>
+        <w:rPr>
+          <w:rtl/>
+          <w:cs/>
+          <w:lang w:val="ar_AE" w:bidi="ar_AE"/>
+        </w:rPr>
+      </w:r>
+      <w:r>
+        <w:rPr>
+          <w:vertAlign w:val="superscript"/>
+          <w:rtl/>
+          <w:cs/>
           <w:lang w:val="ar_AE" w:bidi="ar_AE"/>
         </w:rPr>
         <w:t>20</w:t>
       </w:r>
       <w:r>
         <w:rPr>
+          <w:rtl/>
+          <w:cs/>
           <w:lang w:val="ar_AE" w:bidi="ar_AE"/>
         </w:rPr>
         <w:t xml:space="preserve"> أَمَّا يَهُوذَا فَإِنَّهُ يَسْكُنُ الأَرْضَ إِلَى الأَبَدِ، وَتَعْمُرُ أُورُشَلِيمُ مَدَى الأَجْيَالِ.</w:t>
       </w:r>
-      <w:r>
-        <w:rPr>
-          <w:lang w:val="ar_AE" w:bidi="ar_AE"/>
-        </w:rPr>
-      </w:r>
-      <w:r>
-        <w:rPr>
-          <w:lang w:val="ar_AE" w:bidi="ar_AE"/>
-        </w:rPr>
-      </w:r>
-    </w:p>
-    <w:p>
-      <w:pPr>
-        <w:bidi/>
-      </w:pPr>
-      <w:r>
-        <w:rPr>
-          <w:lang w:val="ar_AE" w:bidi="ar_AE"/>
-        </w:rPr>
-      </w:r>
-    </w:p>
-    <w:p>
-      <w:pPr>
-        <w:bidi/>
-      </w:pPr>
-      <w:r>
-        <w:rPr>
-          <w:lang w:val="ar_AE" w:bidi="ar_AE"/>
-        </w:rPr>
-      </w:r>
-      <w:r>
-        <w:rPr>
-          <w:vertAlign w:val="superscript"/>
+    </w:p>
+    <w:p>
+      <w:pPr>
+        <w:bidi/>
+      </w:pPr>
+      <w:r>
+        <w:rPr>
+          <w:rtl/>
+          <w:cs/>
+          <w:lang w:val="ar_AE" w:bidi="ar_AE"/>
+        </w:rPr>
+      </w:r>
+      <w:r>
+        <w:rPr>
+          <w:vertAlign w:val="superscript"/>
+          <w:rtl/>
+          <w:cs/>
           <w:lang w:val="ar_AE" w:bidi="ar_AE"/>
         </w:rPr>
         <w:t>21</w:t>
       </w:r>
       <w:r>
         <w:rPr>
+          <w:rtl/>
+          <w:cs/>
           <w:lang w:val="ar_AE" w:bidi="ar_AE"/>
         </w:rPr>
         <w:t xml:space="preserve"> وَأُزَكِّي دَمَهُمُ الَّذِي لَمْ أُبَرِّئْهُ، لأَنَّ الرَّبَّ يَسْكُنُ فِي صِهْيَوْنَ.</w:t>
-      </w:r>
-      <w:r>
-        <w:rPr>
-          <w:lang w:val="ar_AE" w:bidi="ar_AE"/>
-        </w:rPr>
-      </w:r>
-      <w:r>
-        <w:rPr>
-          <w:lang w:val="ar_AE" w:bidi="ar_AE"/>
-        </w:rPr>
       </w:r>
     </w:p>
     <w:sectPr>

</xml_diff>